<commit_message>
feat(migration): add seeder for ten years of academic cycles
</commit_message>
<xml_diff>
--- a/apps/sis-laravel/public/templates/PAYROLL_WORD_TEMPLATE.docx
+++ b/apps/sis-laravel/public/templates/PAYROLL_WORD_TEMPLATE.docx
@@ -44,7 +44,7 @@
           </mc:Choice>
           <mc:Fallback>
             <w:drawing>
-              <wp:anchor distT="0" distB="0" distL="114300" distR="114300" simplePos="0" relativeHeight="251659264" behindDoc="0" locked="0" layoutInCell="1" allowOverlap="1" wp14:anchorId="6F4A66AF" wp14:editId="6E16B7F1">
+              <wp:anchor distT="0" distB="0" distL="114300" distR="114300" simplePos="0" relativeHeight="251659264" behindDoc="0" locked="0" layoutInCell="1" allowOverlap="1" wp14:anchorId="7AC2060C" wp14:editId="48583930">
                 <wp:simplePos x="0" y="0"/>
                 <wp:positionH relativeFrom="column">
                   <wp:posOffset>2495550</wp:posOffset>
@@ -170,7 +170,21 @@
         <w:rPr>
           <w:rFonts w:ascii="Arial" w:hAnsi="Arial" w:cs="Arial"/>
         </w:rPr>
-        <w:t>-oOo-</w:t>
+        <w:t>-</w:t>
+      </w:r>
+      <w:proofErr w:type="spellStart"/>
+      <w:r>
+        <w:rPr>
+          <w:rFonts w:ascii="Arial" w:hAnsi="Arial" w:cs="Arial"/>
+        </w:rPr>
+        <w:t>oOo</w:t>
+      </w:r>
+      <w:proofErr w:type="spellEnd"/>
+      <w:r>
+        <w:rPr>
+          <w:rFonts w:ascii="Arial" w:hAnsi="Arial" w:cs="Arial"/>
+        </w:rPr>
+        <w:t>-</w:t>
       </w:r>
     </w:p>
     <w:p>
@@ -196,7 +210,25 @@
           <w:i/>
           <w:iCs/>
         </w:rPr>
-        <w:t>Office of  the City Mayor</w:t>
+        <w:t xml:space="preserve">Office </w:t>
+      </w:r>
+      <w:proofErr w:type="gramStart"/>
+      <w:r>
+        <w:rPr>
+          <w:rFonts w:ascii="Arial" w:hAnsi="Arial" w:cs="Arial"/>
+          <w:i/>
+          <w:iCs/>
+        </w:rPr>
+        <w:t>of  the</w:t>
+      </w:r>
+      <w:proofErr w:type="gramEnd"/>
+      <w:r>
+        <w:rPr>
+          <w:rFonts w:ascii="Arial" w:hAnsi="Arial" w:cs="Arial"/>
+          <w:i/>
+          <w:iCs/>
+        </w:rPr>
+        <w:t xml:space="preserve"> City Mayor</w:t>
       </w:r>
     </w:p>
     <w:p>
@@ -230,7 +262,25 @@
           <w:i/>
           <w:iCs/>
         </w:rPr>
-        <w:t xml:space="preserve"> {date_of_filing}</w:t>
+        <w:t xml:space="preserve"> {</w:t>
+      </w:r>
+      <w:proofErr w:type="spellStart"/>
+      <w:r>
+        <w:rPr>
+          <w:rFonts w:ascii="Arial" w:hAnsi="Arial" w:cs="Arial"/>
+          <w:i/>
+          <w:iCs/>
+        </w:rPr>
+        <w:t>date_of_filing</w:t>
+      </w:r>
+      <w:proofErr w:type="spellEnd"/>
+      <w:r>
+        <w:rPr>
+          <w:rFonts w:ascii="Arial" w:hAnsi="Arial" w:cs="Arial"/>
+          <w:i/>
+          <w:iCs/>
+        </w:rPr>
+        <w:t>}</w:t>
       </w:r>
     </w:p>
     <w:p>
@@ -310,15 +360,17 @@
     </w:p>
     <w:tbl>
       <w:tblPr>
-        <w:tblW w:w="102.0%" w:type="pct"/>
+        <w:tblW w:w="109.22%" w:type="pct"/>
+        <w:tblInd w:w="-35.40pt" w:type="dxa"/>
         <w:tblLayout w:type="fixed"/>
         <w:tblLook w:firstRow="1" w:lastRow="0" w:firstColumn="1" w:lastColumn="0" w:noHBand="0" w:noVBand="1"/>
       </w:tblPr>
       <w:tblGrid>
-        <w:gridCol w:w="576"/>
-        <w:gridCol w:w="2974"/>
-        <w:gridCol w:w="1438"/>
-        <w:gridCol w:w="4412"/>
+        <w:gridCol w:w="286"/>
+        <w:gridCol w:w="2408"/>
+        <w:gridCol w:w="2271"/>
+        <w:gridCol w:w="3402"/>
+        <w:gridCol w:w="1699"/>
       </w:tblGrid>
       <w:tr>
         <w:trPr>
@@ -326,7 +378,7 @@
         </w:trPr>
         <w:tc>
           <w:tcPr>
-            <w:tcW w:w="6.0%" w:type="pct"/>
+            <w:tcW w:w="2.84%" w:type="pct"/>
           </w:tcPr>
           <w:p>
             <w:pPr>
@@ -342,7 +394,7 @@
         </w:tc>
         <w:tc>
           <w:tcPr>
-            <w:tcW w:w="31.0%" w:type="pct"/>
+            <w:tcW w:w="23.92%" w:type="pct"/>
           </w:tcPr>
           <w:p>
             <w:pPr>
@@ -368,7 +420,7 @@
         </w:tc>
         <w:tc>
           <w:tcPr>
-            <w:tcW w:w="15.0%" w:type="pct"/>
+            <w:tcW w:w="22.56%" w:type="pct"/>
           </w:tcPr>
           <w:p>
             <w:pPr>
@@ -396,7 +448,7 @@
         </w:tc>
         <w:tc>
           <w:tcPr>
-            <w:tcW w:w="46.0%" w:type="pct"/>
+            <w:tcW w:w="33.8%" w:type="pct"/>
           </w:tcPr>
           <w:p>
             <w:pPr>
@@ -417,6 +469,22 @@
               <w:t>SCHOOL</w:t>
             </w:r>
           </w:p>
+          <w:p>
+            <w:pPr>
+              <w:spacing w:line="18pt" w:lineRule="auto"/>
+              <w:jc w:val="center"/>
+              <w:rPr>
+                <w:rFonts w:ascii="Arial" w:hAnsi="Arial" w:cs="Arial"/>
+                <w:bCs/>
+                <w:color w:val="000000"/>
+              </w:rPr>
+            </w:pPr>
+          </w:p>
+        </w:tc>
+        <w:tc>
+          <w:tcPr>
+            <w:tcW w:w="16.88%" w:type="pct"/>
+          </w:tcPr>
           <w:p>
             <w:pPr>
               <w:spacing w:line="18pt" w:lineRule="auto"/>
@@ -436,7 +504,7 @@
         </w:trPr>
         <w:tc>
           <w:tcPr>
-            <w:tcW w:w="6.0%" w:type="pct"/>
+            <w:tcW w:w="2.84%" w:type="pct"/>
           </w:tcPr>
           <w:p>
             <w:pPr>
@@ -451,13 +519,13 @@
                 <w:rFonts w:ascii="Arial" w:hAnsi="Arial" w:cs="Arial"/>
                 <w:color w:val="000000"/>
               </w:rPr>
-              <w:t>1.</w:t>
-            </w:r>
-          </w:p>
-        </w:tc>
-        <w:tc>
-          <w:tcPr>
-            <w:tcW w:w="31.0%" w:type="pct"/>
+              <w:t>1</w:t>
+            </w:r>
+          </w:p>
+        </w:tc>
+        <w:tc>
+          <w:tcPr>
+            <w:tcW w:w="23.92%" w:type="pct"/>
           </w:tcPr>
           <w:p>
             <w:pPr>
@@ -483,7 +551,7 @@
         </w:tc>
         <w:tc>
           <w:tcPr>
-            <w:tcW w:w="15.0%" w:type="pct"/>
+            <w:tcW w:w="22.56%" w:type="pct"/>
           </w:tcPr>
           <w:p>
             <w:pPr>
@@ -508,7 +576,7 @@
         </w:tc>
         <w:tc>
           <w:tcPr>
-            <w:tcW w:w="46.0%" w:type="pct"/>
+            <w:tcW w:w="33.8%" w:type="pct"/>
           </w:tcPr>
           <w:p>
             <w:pPr>
@@ -526,6 +594,29 @@
                 <w:szCs w:val="22"/>
               </w:rPr>
               <w:t>{student_1_school}</w:t>
+            </w:r>
+          </w:p>
+        </w:tc>
+        <w:tc>
+          <w:tcPr>
+            <w:tcW w:w="16.88%" w:type="pct"/>
+          </w:tcPr>
+          <w:p>
+            <w:pPr>
+              <w:jc w:val="center"/>
+              <w:rPr>
+                <w:color w:val="000000"/>
+                <w:sz w:val="22"/>
+                <w:szCs w:val="22"/>
+              </w:rPr>
+            </w:pPr>
+            <w:r>
+              <w:rPr>
+                <w:color w:val="000000"/>
+                <w:sz w:val="22"/>
+                <w:szCs w:val="22"/>
+              </w:rPr>
+              <w:t>{passed_1}</w:t>
             </w:r>
           </w:p>
         </w:tc>
@@ -536,7 +627,7 @@
         </w:trPr>
         <w:tc>
           <w:tcPr>
-            <w:tcW w:w="6.0%" w:type="pct"/>
+            <w:tcW w:w="2.84%" w:type="pct"/>
           </w:tcPr>
           <w:p>
             <w:pPr>
@@ -557,7 +648,7 @@
         </w:tc>
         <w:tc>
           <w:tcPr>
-            <w:tcW w:w="31.0%" w:type="pct"/>
+            <w:tcW w:w="23.92%" w:type="pct"/>
           </w:tcPr>
           <w:p>
             <w:pPr>
@@ -583,7 +674,7 @@
         </w:tc>
         <w:tc>
           <w:tcPr>
-            <w:tcW w:w="15.0%" w:type="pct"/>
+            <w:tcW w:w="22.56%" w:type="pct"/>
           </w:tcPr>
           <w:p>
             <w:pPr>
@@ -608,7 +699,7 @@
         </w:tc>
         <w:tc>
           <w:tcPr>
-            <w:tcW w:w="46.0%" w:type="pct"/>
+            <w:tcW w:w="33.8%" w:type="pct"/>
           </w:tcPr>
           <w:p>
             <w:pPr>
@@ -626,6 +717,45 @@
                 <w:szCs w:val="22"/>
               </w:rPr>
               <w:t>{student_2_school}</w:t>
+            </w:r>
+          </w:p>
+        </w:tc>
+        <w:tc>
+          <w:tcPr>
+            <w:tcW w:w="16.88%" w:type="pct"/>
+          </w:tcPr>
+          <w:p>
+            <w:pPr>
+              <w:jc w:val="center"/>
+              <w:rPr>
+                <w:color w:val="000000"/>
+                <w:sz w:val="22"/>
+                <w:szCs w:val="22"/>
+              </w:rPr>
+            </w:pPr>
+            <w:r>
+              <w:rPr>
+                <w:color w:val="000000"/>
+                <w:sz w:val="22"/>
+                <w:szCs w:val="22"/>
+              </w:rPr>
+              <w:t>{passed_</w:t>
+            </w:r>
+            <w:r>
+              <w:rPr>
+                <w:color w:val="000000"/>
+                <w:sz w:val="22"/>
+                <w:szCs w:val="22"/>
+              </w:rPr>
+              <w:t>2</w:t>
+            </w:r>
+            <w:r>
+              <w:rPr>
+                <w:color w:val="000000"/>
+                <w:sz w:val="22"/>
+                <w:szCs w:val="22"/>
+              </w:rPr>
+              <w:t>}</w:t>
             </w:r>
           </w:p>
         </w:tc>
@@ -636,7 +766,7 @@
         </w:trPr>
         <w:tc>
           <w:tcPr>
-            <w:tcW w:w="6.0%" w:type="pct"/>
+            <w:tcW w:w="2.84%" w:type="pct"/>
           </w:tcPr>
           <w:p>
             <w:pPr>
@@ -657,7 +787,7 @@
         </w:tc>
         <w:tc>
           <w:tcPr>
-            <w:tcW w:w="31.0%" w:type="pct"/>
+            <w:tcW w:w="23.92%" w:type="pct"/>
           </w:tcPr>
           <w:p>
             <w:pPr>
@@ -683,7 +813,7 @@
         </w:tc>
         <w:tc>
           <w:tcPr>
-            <w:tcW w:w="15.0%" w:type="pct"/>
+            <w:tcW w:w="22.56%" w:type="pct"/>
           </w:tcPr>
           <w:p>
             <w:pPr>
@@ -708,7 +838,7 @@
         </w:tc>
         <w:tc>
           <w:tcPr>
-            <w:tcW w:w="46.0%" w:type="pct"/>
+            <w:tcW w:w="33.8%" w:type="pct"/>
           </w:tcPr>
           <w:p>
             <w:pPr>
@@ -726,6 +856,45 @@
                 <w:szCs w:val="22"/>
               </w:rPr>
               <w:t>{student_3_school}</w:t>
+            </w:r>
+          </w:p>
+        </w:tc>
+        <w:tc>
+          <w:tcPr>
+            <w:tcW w:w="16.88%" w:type="pct"/>
+          </w:tcPr>
+          <w:p>
+            <w:pPr>
+              <w:jc w:val="center"/>
+              <w:rPr>
+                <w:color w:val="000000"/>
+                <w:sz w:val="22"/>
+                <w:szCs w:val="22"/>
+              </w:rPr>
+            </w:pPr>
+            <w:r>
+              <w:rPr>
+                <w:color w:val="000000"/>
+                <w:sz w:val="22"/>
+                <w:szCs w:val="22"/>
+              </w:rPr>
+              <w:t>{passed_</w:t>
+            </w:r>
+            <w:r>
+              <w:rPr>
+                <w:color w:val="000000"/>
+                <w:sz w:val="22"/>
+                <w:szCs w:val="22"/>
+              </w:rPr>
+              <w:t>3</w:t>
+            </w:r>
+            <w:r>
+              <w:rPr>
+                <w:color w:val="000000"/>
+                <w:sz w:val="22"/>
+                <w:szCs w:val="22"/>
+              </w:rPr>
+              <w:t>}</w:t>
             </w:r>
           </w:p>
         </w:tc>
@@ -736,7 +905,7 @@
         </w:trPr>
         <w:tc>
           <w:tcPr>
-            <w:tcW w:w="6.0%" w:type="pct"/>
+            <w:tcW w:w="2.84%" w:type="pct"/>
           </w:tcPr>
           <w:p>
             <w:pPr>
@@ -757,7 +926,7 @@
         </w:tc>
         <w:tc>
           <w:tcPr>
-            <w:tcW w:w="31.0%" w:type="pct"/>
+            <w:tcW w:w="23.92%" w:type="pct"/>
           </w:tcPr>
           <w:p>
             <w:pPr>
@@ -783,7 +952,7 @@
         </w:tc>
         <w:tc>
           <w:tcPr>
-            <w:tcW w:w="15.0%" w:type="pct"/>
+            <w:tcW w:w="22.56%" w:type="pct"/>
           </w:tcPr>
           <w:p>
             <w:pPr>
@@ -808,7 +977,7 @@
         </w:tc>
         <w:tc>
           <w:tcPr>
-            <w:tcW w:w="46.0%" w:type="pct"/>
+            <w:tcW w:w="33.8%" w:type="pct"/>
           </w:tcPr>
           <w:p>
             <w:pPr>
@@ -826,6 +995,45 @@
                 <w:szCs w:val="22"/>
               </w:rPr>
               <w:t>{student_4_school}</w:t>
+            </w:r>
+          </w:p>
+        </w:tc>
+        <w:tc>
+          <w:tcPr>
+            <w:tcW w:w="16.88%" w:type="pct"/>
+          </w:tcPr>
+          <w:p>
+            <w:pPr>
+              <w:jc w:val="center"/>
+              <w:rPr>
+                <w:color w:val="000000"/>
+                <w:sz w:val="22"/>
+                <w:szCs w:val="22"/>
+              </w:rPr>
+            </w:pPr>
+            <w:r>
+              <w:rPr>
+                <w:color w:val="000000"/>
+                <w:sz w:val="22"/>
+                <w:szCs w:val="22"/>
+              </w:rPr>
+              <w:t>{passed_</w:t>
+            </w:r>
+            <w:r>
+              <w:rPr>
+                <w:color w:val="000000"/>
+                <w:sz w:val="22"/>
+                <w:szCs w:val="22"/>
+              </w:rPr>
+              <w:t>4</w:t>
+            </w:r>
+            <w:r>
+              <w:rPr>
+                <w:color w:val="000000"/>
+                <w:sz w:val="22"/>
+                <w:szCs w:val="22"/>
+              </w:rPr>
+              <w:t>}</w:t>
             </w:r>
           </w:p>
         </w:tc>
@@ -836,7 +1044,7 @@
         </w:trPr>
         <w:tc>
           <w:tcPr>
-            <w:tcW w:w="6.0%" w:type="pct"/>
+            <w:tcW w:w="2.84%" w:type="pct"/>
           </w:tcPr>
           <w:p>
             <w:pPr>
@@ -857,7 +1065,7 @@
         </w:tc>
         <w:tc>
           <w:tcPr>
-            <w:tcW w:w="31.0%" w:type="pct"/>
+            <w:tcW w:w="23.92%" w:type="pct"/>
           </w:tcPr>
           <w:p>
             <w:pPr>
@@ -883,7 +1091,7 @@
         </w:tc>
         <w:tc>
           <w:tcPr>
-            <w:tcW w:w="15.0%" w:type="pct"/>
+            <w:tcW w:w="22.56%" w:type="pct"/>
           </w:tcPr>
           <w:p>
             <w:pPr>
@@ -908,7 +1116,7 @@
         </w:tc>
         <w:tc>
           <w:tcPr>
-            <w:tcW w:w="46.0%" w:type="pct"/>
+            <w:tcW w:w="33.8%" w:type="pct"/>
           </w:tcPr>
           <w:p>
             <w:pPr>
@@ -926,6 +1134,45 @@
                 <w:szCs w:val="22"/>
               </w:rPr>
               <w:t>{student_5_school}</w:t>
+            </w:r>
+          </w:p>
+        </w:tc>
+        <w:tc>
+          <w:tcPr>
+            <w:tcW w:w="16.88%" w:type="pct"/>
+          </w:tcPr>
+          <w:p>
+            <w:pPr>
+              <w:jc w:val="center"/>
+              <w:rPr>
+                <w:color w:val="000000"/>
+                <w:sz w:val="22"/>
+                <w:szCs w:val="22"/>
+              </w:rPr>
+            </w:pPr>
+            <w:r>
+              <w:rPr>
+                <w:color w:val="000000"/>
+                <w:sz w:val="22"/>
+                <w:szCs w:val="22"/>
+              </w:rPr>
+              <w:t>{passed_</w:t>
+            </w:r>
+            <w:r>
+              <w:rPr>
+                <w:color w:val="000000"/>
+                <w:sz w:val="22"/>
+                <w:szCs w:val="22"/>
+              </w:rPr>
+              <w:t>5</w:t>
+            </w:r>
+            <w:r>
+              <w:rPr>
+                <w:color w:val="000000"/>
+                <w:sz w:val="22"/>
+                <w:szCs w:val="22"/>
+              </w:rPr>
+              <w:t>}</w:t>
             </w:r>
           </w:p>
         </w:tc>
@@ -936,7 +1183,7 @@
         </w:trPr>
         <w:tc>
           <w:tcPr>
-            <w:tcW w:w="6.0%" w:type="pct"/>
+            <w:tcW w:w="2.84%" w:type="pct"/>
           </w:tcPr>
           <w:p>
             <w:pPr>
@@ -957,7 +1204,7 @@
         </w:tc>
         <w:tc>
           <w:tcPr>
-            <w:tcW w:w="31.0%" w:type="pct"/>
+            <w:tcW w:w="23.92%" w:type="pct"/>
           </w:tcPr>
           <w:p>
             <w:pPr>
@@ -983,7 +1230,7 @@
         </w:tc>
         <w:tc>
           <w:tcPr>
-            <w:tcW w:w="15.0%" w:type="pct"/>
+            <w:tcW w:w="22.56%" w:type="pct"/>
           </w:tcPr>
           <w:p>
             <w:pPr>
@@ -1008,7 +1255,7 @@
         </w:tc>
         <w:tc>
           <w:tcPr>
-            <w:tcW w:w="46.0%" w:type="pct"/>
+            <w:tcW w:w="33.8%" w:type="pct"/>
           </w:tcPr>
           <w:p>
             <w:pPr>
@@ -1026,6 +1273,45 @@
                 <w:szCs w:val="22"/>
               </w:rPr>
               <w:t>{student_6_school}</w:t>
+            </w:r>
+          </w:p>
+        </w:tc>
+        <w:tc>
+          <w:tcPr>
+            <w:tcW w:w="16.88%" w:type="pct"/>
+          </w:tcPr>
+          <w:p>
+            <w:pPr>
+              <w:jc w:val="center"/>
+              <w:rPr>
+                <w:color w:val="000000"/>
+                <w:sz w:val="22"/>
+                <w:szCs w:val="22"/>
+              </w:rPr>
+            </w:pPr>
+            <w:r>
+              <w:rPr>
+                <w:color w:val="000000"/>
+                <w:sz w:val="22"/>
+                <w:szCs w:val="22"/>
+              </w:rPr>
+              <w:t>{passed_</w:t>
+            </w:r>
+            <w:r>
+              <w:rPr>
+                <w:color w:val="000000"/>
+                <w:sz w:val="22"/>
+                <w:szCs w:val="22"/>
+              </w:rPr>
+              <w:t>6</w:t>
+            </w:r>
+            <w:r>
+              <w:rPr>
+                <w:color w:val="000000"/>
+                <w:sz w:val="22"/>
+                <w:szCs w:val="22"/>
+              </w:rPr>
+              <w:t>}</w:t>
             </w:r>
           </w:p>
         </w:tc>
@@ -1036,7 +1322,7 @@
         </w:trPr>
         <w:tc>
           <w:tcPr>
-            <w:tcW w:w="6.0%" w:type="pct"/>
+            <w:tcW w:w="2.84%" w:type="pct"/>
           </w:tcPr>
           <w:p>
             <w:pPr>
@@ -1057,7 +1343,7 @@
         </w:tc>
         <w:tc>
           <w:tcPr>
-            <w:tcW w:w="31.0%" w:type="pct"/>
+            <w:tcW w:w="23.92%" w:type="pct"/>
           </w:tcPr>
           <w:p>
             <w:pPr>
@@ -1083,7 +1369,7 @@
         </w:tc>
         <w:tc>
           <w:tcPr>
-            <w:tcW w:w="15.0%" w:type="pct"/>
+            <w:tcW w:w="22.56%" w:type="pct"/>
           </w:tcPr>
           <w:p>
             <w:pPr>
@@ -1108,7 +1394,7 @@
         </w:tc>
         <w:tc>
           <w:tcPr>
-            <w:tcW w:w="46.0%" w:type="pct"/>
+            <w:tcW w:w="33.8%" w:type="pct"/>
           </w:tcPr>
           <w:p>
             <w:pPr>
@@ -1126,6 +1412,37 @@
                 <w:szCs w:val="22"/>
               </w:rPr>
               <w:t>{student_7_school}</w:t>
+            </w:r>
+          </w:p>
+        </w:tc>
+        <w:tc>
+          <w:tcPr>
+            <w:tcW w:w="16.88%" w:type="pct"/>
+          </w:tcPr>
+          <w:p>
+            <w:pPr>
+              <w:jc w:val="center"/>
+              <w:rPr>
+                <w:color w:val="000000"/>
+                <w:sz w:val="22"/>
+                <w:szCs w:val="22"/>
+              </w:rPr>
+            </w:pPr>
+            <w:r>
+              <w:rPr>
+                <w:color w:val="000000"/>
+                <w:sz w:val="22"/>
+                <w:szCs w:val="22"/>
+              </w:rPr>
+              <w:t>{passed_</w:t>
+            </w:r>
+            <w:r>
+              <w:rPr>
+                <w:color w:val="000000"/>
+                <w:sz w:val="22"/>
+                <w:szCs w:val="22"/>
+              </w:rPr>
+              <w:t>7}</w:t>
             </w:r>
           </w:p>
         </w:tc>
@@ -1136,7 +1453,7 @@
         </w:trPr>
         <w:tc>
           <w:tcPr>
-            <w:tcW w:w="6.0%" w:type="pct"/>
+            <w:tcW w:w="2.84%" w:type="pct"/>
           </w:tcPr>
           <w:p>
             <w:pPr>
@@ -1157,7 +1474,7 @@
         </w:tc>
         <w:tc>
           <w:tcPr>
-            <w:tcW w:w="31.0%" w:type="pct"/>
+            <w:tcW w:w="23.92%" w:type="pct"/>
           </w:tcPr>
           <w:p>
             <w:pPr>
@@ -1183,7 +1500,7 @@
         </w:tc>
         <w:tc>
           <w:tcPr>
-            <w:tcW w:w="15.0%" w:type="pct"/>
+            <w:tcW w:w="22.56%" w:type="pct"/>
           </w:tcPr>
           <w:p>
             <w:pPr>
@@ -1208,7 +1525,7 @@
         </w:tc>
         <w:tc>
           <w:tcPr>
-            <w:tcW w:w="46.0%" w:type="pct"/>
+            <w:tcW w:w="33.8%" w:type="pct"/>
           </w:tcPr>
           <w:p>
             <w:pPr>
@@ -1226,6 +1543,45 @@
                 <w:szCs w:val="22"/>
               </w:rPr>
               <w:t>{student_8_school}</w:t>
+            </w:r>
+          </w:p>
+        </w:tc>
+        <w:tc>
+          <w:tcPr>
+            <w:tcW w:w="16.88%" w:type="pct"/>
+          </w:tcPr>
+          <w:p>
+            <w:pPr>
+              <w:jc w:val="center"/>
+              <w:rPr>
+                <w:color w:val="000000"/>
+                <w:sz w:val="22"/>
+                <w:szCs w:val="22"/>
+              </w:rPr>
+            </w:pPr>
+            <w:r>
+              <w:rPr>
+                <w:color w:val="000000"/>
+                <w:sz w:val="22"/>
+                <w:szCs w:val="22"/>
+              </w:rPr>
+              <w:t>{passed_</w:t>
+            </w:r>
+            <w:r>
+              <w:rPr>
+                <w:color w:val="000000"/>
+                <w:sz w:val="22"/>
+                <w:szCs w:val="22"/>
+              </w:rPr>
+              <w:t>8</w:t>
+            </w:r>
+            <w:r>
+              <w:rPr>
+                <w:color w:val="000000"/>
+                <w:sz w:val="22"/>
+                <w:szCs w:val="22"/>
+              </w:rPr>
+              <w:t>}</w:t>
             </w:r>
           </w:p>
         </w:tc>
@@ -1236,7 +1592,7 @@
         </w:trPr>
         <w:tc>
           <w:tcPr>
-            <w:tcW w:w="6.0%" w:type="pct"/>
+            <w:tcW w:w="2.84%" w:type="pct"/>
           </w:tcPr>
           <w:p>
             <w:pPr>
@@ -1257,7 +1613,7 @@
         </w:tc>
         <w:tc>
           <w:tcPr>
-            <w:tcW w:w="31.0%" w:type="pct"/>
+            <w:tcW w:w="23.92%" w:type="pct"/>
           </w:tcPr>
           <w:p>
             <w:pPr>
@@ -1283,7 +1639,7 @@
         </w:tc>
         <w:tc>
           <w:tcPr>
-            <w:tcW w:w="15.0%" w:type="pct"/>
+            <w:tcW w:w="22.56%" w:type="pct"/>
           </w:tcPr>
           <w:p>
             <w:pPr>
@@ -1308,7 +1664,7 @@
         </w:tc>
         <w:tc>
           <w:tcPr>
-            <w:tcW w:w="46.0%" w:type="pct"/>
+            <w:tcW w:w="33.8%" w:type="pct"/>
           </w:tcPr>
           <w:p>
             <w:pPr>
@@ -1326,6 +1682,45 @@
                 <w:szCs w:val="22"/>
               </w:rPr>
               <w:t>{student_9_school}</w:t>
+            </w:r>
+          </w:p>
+        </w:tc>
+        <w:tc>
+          <w:tcPr>
+            <w:tcW w:w="16.88%" w:type="pct"/>
+          </w:tcPr>
+          <w:p>
+            <w:pPr>
+              <w:jc w:val="center"/>
+              <w:rPr>
+                <w:color w:val="000000"/>
+                <w:sz w:val="22"/>
+                <w:szCs w:val="22"/>
+              </w:rPr>
+            </w:pPr>
+            <w:r>
+              <w:rPr>
+                <w:color w:val="000000"/>
+                <w:sz w:val="22"/>
+                <w:szCs w:val="22"/>
+              </w:rPr>
+              <w:t>{passed_</w:t>
+            </w:r>
+            <w:r>
+              <w:rPr>
+                <w:color w:val="000000"/>
+                <w:sz w:val="22"/>
+                <w:szCs w:val="22"/>
+              </w:rPr>
+              <w:t>9</w:t>
+            </w:r>
+            <w:r>
+              <w:rPr>
+                <w:color w:val="000000"/>
+                <w:sz w:val="22"/>
+                <w:szCs w:val="22"/>
+              </w:rPr>
+              <w:t>}</w:t>
             </w:r>
           </w:p>
         </w:tc>
@@ -1336,7 +1731,7 @@
         </w:trPr>
         <w:tc>
           <w:tcPr>
-            <w:tcW w:w="6.0%" w:type="pct"/>
+            <w:tcW w:w="2.84%" w:type="pct"/>
           </w:tcPr>
           <w:p>
             <w:pPr>
@@ -1357,7 +1752,7 @@
         </w:tc>
         <w:tc>
           <w:tcPr>
-            <w:tcW w:w="31.0%" w:type="pct"/>
+            <w:tcW w:w="23.92%" w:type="pct"/>
           </w:tcPr>
           <w:p>
             <w:pPr>
@@ -1383,7 +1778,7 @@
         </w:tc>
         <w:tc>
           <w:tcPr>
-            <w:tcW w:w="15.0%" w:type="pct"/>
+            <w:tcW w:w="22.56%" w:type="pct"/>
           </w:tcPr>
           <w:p>
             <w:pPr>
@@ -1408,7 +1803,7 @@
         </w:tc>
         <w:tc>
           <w:tcPr>
-            <w:tcW w:w="46.0%" w:type="pct"/>
+            <w:tcW w:w="33.8%" w:type="pct"/>
           </w:tcPr>
           <w:p>
             <w:pPr>
@@ -1426,6 +1821,45 @@
                 <w:szCs w:val="22"/>
               </w:rPr>
               <w:t>{student_10_school}</w:t>
+            </w:r>
+          </w:p>
+        </w:tc>
+        <w:tc>
+          <w:tcPr>
+            <w:tcW w:w="16.88%" w:type="pct"/>
+          </w:tcPr>
+          <w:p>
+            <w:pPr>
+              <w:jc w:val="center"/>
+              <w:rPr>
+                <w:color w:val="000000"/>
+                <w:sz w:val="22"/>
+                <w:szCs w:val="22"/>
+              </w:rPr>
+            </w:pPr>
+            <w:r>
+              <w:rPr>
+                <w:color w:val="000000"/>
+                <w:sz w:val="22"/>
+                <w:szCs w:val="22"/>
+              </w:rPr>
+              <w:t>{passed_1</w:t>
+            </w:r>
+            <w:r>
+              <w:rPr>
+                <w:color w:val="000000"/>
+                <w:sz w:val="22"/>
+                <w:szCs w:val="22"/>
+              </w:rPr>
+              <w:t>0</w:t>
+            </w:r>
+            <w:r>
+              <w:rPr>
+                <w:color w:val="000000"/>
+                <w:sz w:val="22"/>
+                <w:szCs w:val="22"/>
+              </w:rPr>
+              <w:t>}</w:t>
             </w:r>
           </w:p>
         </w:tc>
@@ -1436,7 +1870,7 @@
         </w:trPr>
         <w:tc>
           <w:tcPr>
-            <w:tcW w:w="6.0%" w:type="pct"/>
+            <w:tcW w:w="2.84%" w:type="pct"/>
           </w:tcPr>
           <w:p>
             <w:pPr>
@@ -1457,7 +1891,7 @@
         </w:tc>
         <w:tc>
           <w:tcPr>
-            <w:tcW w:w="31.0%" w:type="pct"/>
+            <w:tcW w:w="23.92%" w:type="pct"/>
           </w:tcPr>
           <w:p>
             <w:pPr>
@@ -1483,7 +1917,7 @@
         </w:tc>
         <w:tc>
           <w:tcPr>
-            <w:tcW w:w="15.0%" w:type="pct"/>
+            <w:tcW w:w="22.56%" w:type="pct"/>
           </w:tcPr>
           <w:p>
             <w:pPr>
@@ -1508,7 +1942,7 @@
         </w:tc>
         <w:tc>
           <w:tcPr>
-            <w:tcW w:w="46.0%" w:type="pct"/>
+            <w:tcW w:w="33.8%" w:type="pct"/>
           </w:tcPr>
           <w:p>
             <w:pPr>
@@ -1526,6 +1960,45 @@
                 <w:szCs w:val="22"/>
               </w:rPr>
               <w:t>{student_11_school}</w:t>
+            </w:r>
+          </w:p>
+        </w:tc>
+        <w:tc>
+          <w:tcPr>
+            <w:tcW w:w="16.88%" w:type="pct"/>
+          </w:tcPr>
+          <w:p>
+            <w:pPr>
+              <w:jc w:val="center"/>
+              <w:rPr>
+                <w:color w:val="000000"/>
+                <w:sz w:val="22"/>
+                <w:szCs w:val="22"/>
+              </w:rPr>
+            </w:pPr>
+            <w:r>
+              <w:rPr>
+                <w:color w:val="000000"/>
+                <w:sz w:val="22"/>
+                <w:szCs w:val="22"/>
+              </w:rPr>
+              <w:t>{passed_1</w:t>
+            </w:r>
+            <w:r>
+              <w:rPr>
+                <w:color w:val="000000"/>
+                <w:sz w:val="22"/>
+                <w:szCs w:val="22"/>
+              </w:rPr>
+              <w:t>1</w:t>
+            </w:r>
+            <w:r>
+              <w:rPr>
+                <w:color w:val="000000"/>
+                <w:sz w:val="22"/>
+                <w:szCs w:val="22"/>
+              </w:rPr>
+              <w:t>}</w:t>
             </w:r>
           </w:p>
         </w:tc>
@@ -1536,7 +2009,7 @@
         </w:trPr>
         <w:tc>
           <w:tcPr>
-            <w:tcW w:w="6.0%" w:type="pct"/>
+            <w:tcW w:w="2.84%" w:type="pct"/>
           </w:tcPr>
           <w:p>
             <w:pPr>
@@ -1557,7 +2030,7 @@
         </w:tc>
         <w:tc>
           <w:tcPr>
-            <w:tcW w:w="31.0%" w:type="pct"/>
+            <w:tcW w:w="23.92%" w:type="pct"/>
           </w:tcPr>
           <w:p>
             <w:pPr>
@@ -1583,7 +2056,7 @@
         </w:tc>
         <w:tc>
           <w:tcPr>
-            <w:tcW w:w="15.0%" w:type="pct"/>
+            <w:tcW w:w="22.56%" w:type="pct"/>
           </w:tcPr>
           <w:p>
             <w:pPr>
@@ -1608,7 +2081,7 @@
         </w:tc>
         <w:tc>
           <w:tcPr>
-            <w:tcW w:w="46.0%" w:type="pct"/>
+            <w:tcW w:w="33.8%" w:type="pct"/>
           </w:tcPr>
           <w:p>
             <w:pPr>
@@ -1626,6 +2099,45 @@
                 <w:szCs w:val="22"/>
               </w:rPr>
               <w:t>{student_12_school}</w:t>
+            </w:r>
+          </w:p>
+        </w:tc>
+        <w:tc>
+          <w:tcPr>
+            <w:tcW w:w="16.88%" w:type="pct"/>
+          </w:tcPr>
+          <w:p>
+            <w:pPr>
+              <w:jc w:val="center"/>
+              <w:rPr>
+                <w:color w:val="000000"/>
+                <w:sz w:val="22"/>
+                <w:szCs w:val="22"/>
+              </w:rPr>
+            </w:pPr>
+            <w:r>
+              <w:rPr>
+                <w:color w:val="000000"/>
+                <w:sz w:val="22"/>
+                <w:szCs w:val="22"/>
+              </w:rPr>
+              <w:t>{passed_1</w:t>
+            </w:r>
+            <w:r>
+              <w:rPr>
+                <w:color w:val="000000"/>
+                <w:sz w:val="22"/>
+                <w:szCs w:val="22"/>
+              </w:rPr>
+              <w:t>2</w:t>
+            </w:r>
+            <w:r>
+              <w:rPr>
+                <w:color w:val="000000"/>
+                <w:sz w:val="22"/>
+                <w:szCs w:val="22"/>
+              </w:rPr>
+              <w:t>}</w:t>
             </w:r>
           </w:p>
         </w:tc>
@@ -1636,7 +2148,7 @@
         </w:trPr>
         <w:tc>
           <w:tcPr>
-            <w:tcW w:w="6.0%" w:type="pct"/>
+            <w:tcW w:w="2.84%" w:type="pct"/>
           </w:tcPr>
           <w:p>
             <w:pPr>
@@ -1657,7 +2169,7 @@
         </w:tc>
         <w:tc>
           <w:tcPr>
-            <w:tcW w:w="31.0%" w:type="pct"/>
+            <w:tcW w:w="23.92%" w:type="pct"/>
           </w:tcPr>
           <w:p>
             <w:pPr>
@@ -1683,7 +2195,7 @@
         </w:tc>
         <w:tc>
           <w:tcPr>
-            <w:tcW w:w="15.0%" w:type="pct"/>
+            <w:tcW w:w="22.56%" w:type="pct"/>
           </w:tcPr>
           <w:p>
             <w:pPr>
@@ -1708,7 +2220,7 @@
         </w:tc>
         <w:tc>
           <w:tcPr>
-            <w:tcW w:w="46.0%" w:type="pct"/>
+            <w:tcW w:w="33.8%" w:type="pct"/>
           </w:tcPr>
           <w:p>
             <w:pPr>
@@ -1726,6 +2238,45 @@
                 <w:szCs w:val="22"/>
               </w:rPr>
               <w:t>{student_13_school}</w:t>
+            </w:r>
+          </w:p>
+        </w:tc>
+        <w:tc>
+          <w:tcPr>
+            <w:tcW w:w="16.88%" w:type="pct"/>
+          </w:tcPr>
+          <w:p>
+            <w:pPr>
+              <w:jc w:val="center"/>
+              <w:rPr>
+                <w:color w:val="000000"/>
+                <w:sz w:val="22"/>
+                <w:szCs w:val="22"/>
+              </w:rPr>
+            </w:pPr>
+            <w:r>
+              <w:rPr>
+                <w:color w:val="000000"/>
+                <w:sz w:val="22"/>
+                <w:szCs w:val="22"/>
+              </w:rPr>
+              <w:t>{passed_1</w:t>
+            </w:r>
+            <w:r>
+              <w:rPr>
+                <w:color w:val="000000"/>
+                <w:sz w:val="22"/>
+                <w:szCs w:val="22"/>
+              </w:rPr>
+              <w:t>3</w:t>
+            </w:r>
+            <w:r>
+              <w:rPr>
+                <w:color w:val="000000"/>
+                <w:sz w:val="22"/>
+                <w:szCs w:val="22"/>
+              </w:rPr>
+              <w:t>}</w:t>
             </w:r>
           </w:p>
         </w:tc>
@@ -1736,7 +2287,7 @@
         </w:trPr>
         <w:tc>
           <w:tcPr>
-            <w:tcW w:w="6.0%" w:type="pct"/>
+            <w:tcW w:w="2.84%" w:type="pct"/>
           </w:tcPr>
           <w:p>
             <w:pPr>
@@ -1757,7 +2308,7 @@
         </w:tc>
         <w:tc>
           <w:tcPr>
-            <w:tcW w:w="31.0%" w:type="pct"/>
+            <w:tcW w:w="23.92%" w:type="pct"/>
           </w:tcPr>
           <w:p>
             <w:pPr>
@@ -1783,7 +2334,7 @@
         </w:tc>
         <w:tc>
           <w:tcPr>
-            <w:tcW w:w="15.0%" w:type="pct"/>
+            <w:tcW w:w="22.56%" w:type="pct"/>
           </w:tcPr>
           <w:p>
             <w:pPr>
@@ -1808,7 +2359,7 @@
         </w:tc>
         <w:tc>
           <w:tcPr>
-            <w:tcW w:w="46.0%" w:type="pct"/>
+            <w:tcW w:w="33.8%" w:type="pct"/>
           </w:tcPr>
           <w:p>
             <w:pPr>
@@ -1826,6 +2377,45 @@
                 <w:szCs w:val="22"/>
               </w:rPr>
               <w:t>{student_14_school}</w:t>
+            </w:r>
+          </w:p>
+        </w:tc>
+        <w:tc>
+          <w:tcPr>
+            <w:tcW w:w="16.88%" w:type="pct"/>
+          </w:tcPr>
+          <w:p>
+            <w:pPr>
+              <w:jc w:val="center"/>
+              <w:rPr>
+                <w:color w:val="000000"/>
+                <w:sz w:val="22"/>
+                <w:szCs w:val="22"/>
+              </w:rPr>
+            </w:pPr>
+            <w:r>
+              <w:rPr>
+                <w:color w:val="000000"/>
+                <w:sz w:val="22"/>
+                <w:szCs w:val="22"/>
+              </w:rPr>
+              <w:t>{passed_1</w:t>
+            </w:r>
+            <w:r>
+              <w:rPr>
+                <w:color w:val="000000"/>
+                <w:sz w:val="22"/>
+                <w:szCs w:val="22"/>
+              </w:rPr>
+              <w:t>4</w:t>
+            </w:r>
+            <w:r>
+              <w:rPr>
+                <w:color w:val="000000"/>
+                <w:sz w:val="22"/>
+                <w:szCs w:val="22"/>
+              </w:rPr>
+              <w:t>}</w:t>
             </w:r>
           </w:p>
         </w:tc>
@@ -1836,7 +2426,7 @@
         </w:trPr>
         <w:tc>
           <w:tcPr>
-            <w:tcW w:w="6.0%" w:type="pct"/>
+            <w:tcW w:w="2.84%" w:type="pct"/>
           </w:tcPr>
           <w:p>
             <w:pPr>
@@ -1857,7 +2447,7 @@
         </w:tc>
         <w:tc>
           <w:tcPr>
-            <w:tcW w:w="31.0%" w:type="pct"/>
+            <w:tcW w:w="23.92%" w:type="pct"/>
           </w:tcPr>
           <w:p>
             <w:pPr>
@@ -1883,7 +2473,7 @@
         </w:tc>
         <w:tc>
           <w:tcPr>
-            <w:tcW w:w="15.0%" w:type="pct"/>
+            <w:tcW w:w="22.56%" w:type="pct"/>
           </w:tcPr>
           <w:p>
             <w:pPr>
@@ -1908,7 +2498,7 @@
         </w:tc>
         <w:tc>
           <w:tcPr>
-            <w:tcW w:w="46.0%" w:type="pct"/>
+            <w:tcW w:w="33.8%" w:type="pct"/>
           </w:tcPr>
           <w:p>
             <w:pPr>
@@ -1926,6 +2516,45 @@
                 <w:szCs w:val="22"/>
               </w:rPr>
               <w:t>{student_15_school}</w:t>
+            </w:r>
+          </w:p>
+        </w:tc>
+        <w:tc>
+          <w:tcPr>
+            <w:tcW w:w="16.88%" w:type="pct"/>
+          </w:tcPr>
+          <w:p>
+            <w:pPr>
+              <w:jc w:val="center"/>
+              <w:rPr>
+                <w:color w:val="000000"/>
+                <w:sz w:val="22"/>
+                <w:szCs w:val="22"/>
+              </w:rPr>
+            </w:pPr>
+            <w:r>
+              <w:rPr>
+                <w:color w:val="000000"/>
+                <w:sz w:val="22"/>
+                <w:szCs w:val="22"/>
+              </w:rPr>
+              <w:t>{passed_1</w:t>
+            </w:r>
+            <w:r>
+              <w:rPr>
+                <w:color w:val="000000"/>
+                <w:sz w:val="22"/>
+                <w:szCs w:val="22"/>
+              </w:rPr>
+              <w:t>5</w:t>
+            </w:r>
+            <w:r>
+              <w:rPr>
+                <w:color w:val="000000"/>
+                <w:sz w:val="22"/>
+                <w:szCs w:val="22"/>
+              </w:rPr>
+              <w:t>}</w:t>
             </w:r>
           </w:p>
         </w:tc>
@@ -1936,7 +2565,7 @@
         </w:trPr>
         <w:tc>
           <w:tcPr>
-            <w:tcW w:w="6.0%" w:type="pct"/>
+            <w:tcW w:w="2.84%" w:type="pct"/>
           </w:tcPr>
           <w:p>
             <w:pPr>
@@ -1950,7 +2579,7 @@
         </w:tc>
         <w:tc>
           <w:tcPr>
-            <w:tcW w:w="31.0%" w:type="pct"/>
+            <w:tcW w:w="23.92%" w:type="pct"/>
           </w:tcPr>
           <w:p>
             <w:pPr>
@@ -1976,23 +2605,38 @@
         </w:tc>
         <w:tc>
           <w:tcPr>
-            <w:tcW w:w="15.0%" w:type="pct"/>
-          </w:tcPr>
-          <w:p>
-            <w:pPr>
-              <w:jc w:val="center"/>
-              <w:rPr>
-                <w:rFonts w:ascii="Arial" w:hAnsi="Arial" w:cs="Arial"/>
-                <w:color w:val="000000"/>
-                <w:sz w:val="22"/>
-                <w:szCs w:val="22"/>
-              </w:rPr>
-            </w:pPr>
-          </w:p>
-        </w:tc>
-        <w:tc>
-          <w:tcPr>
-            <w:tcW w:w="46.0%" w:type="pct"/>
+            <w:tcW w:w="22.56%" w:type="pct"/>
+          </w:tcPr>
+          <w:p>
+            <w:pPr>
+              <w:jc w:val="center"/>
+              <w:rPr>
+                <w:rFonts w:ascii="Arial" w:hAnsi="Arial" w:cs="Arial"/>
+                <w:color w:val="000000"/>
+                <w:sz w:val="22"/>
+                <w:szCs w:val="22"/>
+              </w:rPr>
+            </w:pPr>
+          </w:p>
+        </w:tc>
+        <w:tc>
+          <w:tcPr>
+            <w:tcW w:w="33.8%" w:type="pct"/>
+          </w:tcPr>
+          <w:p>
+            <w:pPr>
+              <w:jc w:val="center"/>
+              <w:rPr>
+                <w:color w:val="000000"/>
+                <w:sz w:val="22"/>
+                <w:szCs w:val="22"/>
+              </w:rPr>
+            </w:pPr>
+          </w:p>
+        </w:tc>
+        <w:tc>
+          <w:tcPr>
+            <w:tcW w:w="16.88%" w:type="pct"/>
           </w:tcPr>
           <w:p>
             <w:pPr>
@@ -2110,7 +2754,35 @@
         <w:rPr>
           <w:rFonts w:ascii="Arial" w:hAnsi="Arial" w:cs="Arial"/>
         </w:rPr>
-        <w:t xml:space="preserve">- - - - - - - - - - - - - - - - - - - - - - - - - - - - - - - - - - - - - - - - - - - - - - - - - - -  - - - - - - -  - </w:t>
+        <w:t xml:space="preserve">- - - - - - - - - - - - - - - - - - - - - - - - - - - - - - - - - - - - - - - - - - - - - - - - - - </w:t>
+      </w:r>
+      <w:proofErr w:type="gramStart"/>
+      <w:r>
+        <w:rPr>
+          <w:rFonts w:ascii="Arial" w:hAnsi="Arial" w:cs="Arial"/>
+        </w:rPr>
+        <w:t>-  -</w:t>
+      </w:r>
+      <w:proofErr w:type="gramEnd"/>
+      <w:r>
+        <w:rPr>
+          <w:rFonts w:ascii="Arial" w:hAnsi="Arial" w:cs="Arial"/>
+        </w:rPr>
+        <w:t xml:space="preserve"> - - - - - </w:t>
+      </w:r>
+      <w:proofErr w:type="gramStart"/>
+      <w:r>
+        <w:rPr>
+          <w:rFonts w:ascii="Arial" w:hAnsi="Arial" w:cs="Arial"/>
+        </w:rPr>
+        <w:t>-  -</w:t>
+      </w:r>
+      <w:proofErr w:type="gramEnd"/>
+      <w:r>
+        <w:rPr>
+          <w:rFonts w:ascii="Arial" w:hAnsi="Arial" w:cs="Arial"/>
+        </w:rPr>
+        <w:t xml:space="preserve"> </w:t>
       </w:r>
     </w:p>
     <w:p>
@@ -2138,6 +2810,7 @@
         <w:rPr>
           <w:rFonts w:ascii="Arial" w:hAnsi="Arial" w:cs="Arial"/>
         </w:rPr>
+        <w:lastRenderedPageBreak/>
         <w:t>RECOMMENDATION</w:t>
       </w:r>
     </w:p>
@@ -2162,7 +2835,6 @@
         <w:rPr>
           <w:rFonts w:ascii="Arial" w:hAnsi="Arial" w:cs="Arial"/>
         </w:rPr>
-        <w:lastRenderedPageBreak/>
         <w:t xml:space="preserve">Release of financial assistance of scholar/s stated above for </w:t>
       </w:r>
       <w:r>
@@ -2171,21 +2843,57 @@
           <w:b/>
           <w:bCs/>
         </w:rPr>
-        <w:t>{sem_number}</w:t>
-      </w:r>
-      <w:r>
-        <w:rPr>
-          <w:rFonts w:ascii="Arial" w:hAnsi="Arial" w:cs="Arial"/>
-        </w:rPr>
-        <w:t xml:space="preserve"> School Year </w:t>
-      </w:r>
+        <w:t>{</w:t>
+      </w:r>
+      <w:proofErr w:type="spellStart"/>
       <w:r>
         <w:rPr>
           <w:rFonts w:ascii="Arial" w:hAnsi="Arial" w:cs="Arial"/>
           <w:b/>
           <w:bCs/>
         </w:rPr>
-        <w:t>{school_year}</w:t>
+        <w:t>sem_number</w:t>
+      </w:r>
+      <w:proofErr w:type="spellEnd"/>
+      <w:r>
+        <w:rPr>
+          <w:rFonts w:ascii="Arial" w:hAnsi="Arial" w:cs="Arial"/>
+          <w:b/>
+          <w:bCs/>
+        </w:rPr>
+        <w:t>}</w:t>
+      </w:r>
+      <w:r>
+        <w:rPr>
+          <w:rFonts w:ascii="Arial" w:hAnsi="Arial" w:cs="Arial"/>
+        </w:rPr>
+        <w:t xml:space="preserve"> School Year </w:t>
+      </w:r>
+      <w:r>
+        <w:rPr>
+          <w:rFonts w:ascii="Arial" w:hAnsi="Arial" w:cs="Arial"/>
+          <w:b/>
+          <w:bCs/>
+        </w:rPr>
+        <w:t>{</w:t>
+      </w:r>
+      <w:proofErr w:type="spellStart"/>
+      <w:r>
+        <w:rPr>
+          <w:rFonts w:ascii="Arial" w:hAnsi="Arial" w:cs="Arial"/>
+          <w:b/>
+          <w:bCs/>
+        </w:rPr>
+        <w:t>school_year</w:t>
+      </w:r>
+      <w:proofErr w:type="spellEnd"/>
+      <w:r>
+        <w:rPr>
+          <w:rFonts w:ascii="Arial" w:hAnsi="Arial" w:cs="Arial"/>
+          <w:b/>
+          <w:bCs/>
+        </w:rPr>
+        <w:t>}</w:t>
       </w:r>
       <w:r>
         <w:rPr>
@@ -3022,6 +3730,66 @@
       </w:tcPr>
     </w:tblStylePr>
   </w:style>
+  <w:style w:type="table" w:styleId="PlainTable1">
+    <w:name w:val="Plain Table 1"/>
+    <w:basedOn w:val="TableNormal"/>
+    <w:uiPriority w:val="41"/>
+    <w:rsid w:val="00DC0842"/>
+    <w:tblPr>
+      <w:tblStyleRowBandSize w:val="1"/>
+      <w:tblStyleColBandSize w:val="1"/>
+      <w:tblBorders>
+        <w:top w:val="single" w:sz="4" w:space="0" w:color="BFBFBF"/>
+        <w:start w:val="single" w:sz="4" w:space="0" w:color="BFBFBF"/>
+        <w:bottom w:val="single" w:sz="4" w:space="0" w:color="BFBFBF"/>
+        <w:end w:val="single" w:sz="4" w:space="0" w:color="BFBFBF"/>
+        <w:insideH w:val="single" w:sz="4" w:space="0" w:color="BFBFBF"/>
+        <w:insideV w:val="single" w:sz="4" w:space="0" w:color="BFBFBF"/>
+      </w:tblBorders>
+    </w:tblPr>
+    <w:tblStylePr w:type="firstRow">
+      <w:rPr>
+        <w:b/>
+        <w:bCs/>
+      </w:rPr>
+    </w:tblStylePr>
+    <w:tblStylePr w:type="lastRow">
+      <w:rPr>
+        <w:b/>
+        <w:bCs/>
+      </w:rPr>
+      <w:tblPr/>
+      <w:tcPr>
+        <w:tcBorders>
+          <w:top w:val="double" w:sz="4" w:space="0" w:color="BFBFBF"/>
+        </w:tcBorders>
+      </w:tcPr>
+    </w:tblStylePr>
+    <w:tblStylePr w:type="firstCol">
+      <w:rPr>
+        <w:b/>
+        <w:bCs/>
+      </w:rPr>
+    </w:tblStylePr>
+    <w:tblStylePr w:type="lastCol">
+      <w:rPr>
+        <w:b/>
+        <w:bCs/>
+      </w:rPr>
+    </w:tblStylePr>
+    <w:tblStylePr w:type="band1Vert">
+      <w:tblPr/>
+      <w:tcPr>
+        <w:shd w:val="clear" w:color="auto" w:fill="F2F2F2"/>
+      </w:tcPr>
+    </w:tblStylePr>
+    <w:tblStylePr w:type="band1Horz">
+      <w:tblPr/>
+      <w:tcPr>
+        <w:shd w:val="clear" w:color="auto" w:fill="F2F2F2"/>
+      </w:tcPr>
+    </w:tblStylePr>
+  </w:style>
 </w:styles>
 </file>
 

</xml_diff>

<commit_message>
fix(templates): clean up formatting in payroll document
</commit_message>
<xml_diff>
--- a/apps/sis-laravel/public/templates/PAYROLL_WORD_TEMPLATE.docx
+++ b/apps/sis-laravel/public/templates/PAYROLL_WORD_TEMPLATE.docx
@@ -218,18 +218,13 @@
         <w:tab/>
       </w:r>
     </w:p>
-    <w:p>
-      <w:pPr>
-        <w:rPr>
-          <w:rFonts w:ascii="Arial" w:hAnsi="Arial" w:cs="Arial"/>
-        </w:rPr>
-      </w:pPr>
-    </w:p>
     <w:tbl>
       <w:tblPr>
         <w:tblStyle w:val="5"/>
-        <w:tblW w:w="6125" w:type="pct"/>
-        <w:tblInd w:w="-1217" w:type="dxa"/>
+        <w:tblpPr w:leftFromText="180" w:rightFromText="180" w:vertAnchor="text" w:horzAnchor="page" w:tblpX="406" w:tblpY="272"/>
+        <w:tblOverlap w:val="never"/>
+        <w:tblW w:w="6347" w:type="pct"/>
+        <w:tblInd w:w="0" w:type="dxa"/>
         <w:tblLayout w:type="fixed"/>
         <w:tblCellMar>
           <w:top w:w="0" w:type="dxa"/>
@@ -240,10 +235,10 @@
       </w:tblPr>
       <w:tblGrid>
         <w:gridCol w:w="490"/>
-        <w:gridCol w:w="3464"/>
-        <w:gridCol w:w="2468"/>
-        <w:gridCol w:w="3614"/>
-        <w:gridCol w:w="1254"/>
+        <w:gridCol w:w="3765"/>
+        <w:gridCol w:w="2165"/>
+        <w:gridCol w:w="3998"/>
+        <w:gridCol w:w="1282"/>
       </w:tblGrid>
       <w:tr>
         <w:tblPrEx>
@@ -259,7 +254,7 @@
         </w:trPr>
         <w:tc>
           <w:tcPr>
-            <w:tcW w:w="217" w:type="pct"/>
+            <w:tcW w:w="209" w:type="pct"/>
           </w:tcPr>
           <w:p>
             <w:pPr>
@@ -277,7 +272,7 @@
         </w:tc>
         <w:tc>
           <w:tcPr>
-            <w:tcW w:w="1534" w:type="pct"/>
+            <w:tcW w:w="1608" w:type="pct"/>
           </w:tcPr>
           <w:p>
             <w:pPr>
@@ -307,7 +302,7 @@
         </w:tc>
         <w:tc>
           <w:tcPr>
-            <w:tcW w:w="1093" w:type="pct"/>
+            <w:tcW w:w="925" w:type="pct"/>
           </w:tcPr>
           <w:p>
             <w:pPr>
@@ -335,7 +330,7 @@
         </w:tc>
         <w:tc>
           <w:tcPr>
-            <w:tcW w:w="1600" w:type="pct"/>
+            <w:tcW w:w="1708" w:type="pct"/>
           </w:tcPr>
           <w:p>
             <w:pPr>
@@ -376,7 +371,7 @@
         </w:tc>
         <w:tc>
           <w:tcPr>
-            <w:tcW w:w="555" w:type="pct"/>
+            <w:tcW w:w="547" w:type="pct"/>
           </w:tcPr>
           <w:p>
             <w:pPr>
@@ -407,7 +402,7 @@
         </w:trPr>
         <w:tc>
           <w:tcPr>
-            <w:tcW w:w="217" w:type="pct"/>
+            <w:tcW w:w="209" w:type="pct"/>
           </w:tcPr>
           <w:p>
             <w:pPr>
@@ -432,7 +427,7 @@
         </w:tc>
         <w:tc>
           <w:tcPr>
-            <w:tcW w:w="1534" w:type="pct"/>
+            <w:tcW w:w="1608" w:type="pct"/>
           </w:tcPr>
           <w:p>
             <w:pPr>
@@ -458,24 +453,24 @@
         </w:tc>
         <w:tc>
           <w:tcPr>
-            <w:tcW w:w="1093" w:type="pct"/>
-          </w:tcPr>
-          <w:p>
-            <w:pPr>
-              <w:jc w:val="center"/>
-              <w:rPr>
-                <w:rFonts w:ascii="Arial" w:hAnsi="Arial" w:cs="Arial"/>
-                <w:color w:val="000000"/>
-                <w:sz w:val="20"/>
-                <w:szCs w:val="20"/>
-              </w:rPr>
-            </w:pPr>
-            <w:r>
-              <w:rPr>
-                <w:rFonts w:ascii="Arial" w:hAnsi="Arial" w:cs="Arial"/>
-                <w:color w:val="000000"/>
-                <w:sz w:val="20"/>
-                <w:szCs w:val="20"/>
+            <w:tcW w:w="925" w:type="pct"/>
+          </w:tcPr>
+          <w:p>
+            <w:pPr>
+              <w:jc w:val="center"/>
+              <w:rPr>
+                <w:rFonts w:ascii="Arial" w:hAnsi="Arial" w:cs="Arial"/>
+                <w:color w:val="000000"/>
+                <w:sz w:val="18"/>
+                <w:szCs w:val="18"/>
+              </w:rPr>
+            </w:pPr>
+            <w:r>
+              <w:rPr>
+                <w:rFonts w:ascii="Arial" w:hAnsi="Arial" w:cs="Arial"/>
+                <w:color w:val="000000"/>
+                <w:sz w:val="18"/>
+                <w:szCs w:val="18"/>
               </w:rPr>
               <w:t>{student_1_year_level}</w:t>
             </w:r>
@@ -483,22 +478,22 @@
         </w:tc>
         <w:tc>
           <w:tcPr>
-            <w:tcW w:w="1600" w:type="pct"/>
-          </w:tcPr>
-          <w:p>
-            <w:pPr>
-              <w:jc w:val="center"/>
-              <w:rPr>
-                <w:color w:val="000000"/>
-                <w:sz w:val="20"/>
-                <w:szCs w:val="20"/>
-              </w:rPr>
-            </w:pPr>
-            <w:r>
-              <w:rPr>
-                <w:color w:val="000000"/>
-                <w:sz w:val="20"/>
-                <w:szCs w:val="20"/>
+            <w:tcW w:w="1708" w:type="pct"/>
+          </w:tcPr>
+          <w:p>
+            <w:pPr>
+              <w:jc w:val="center"/>
+              <w:rPr>
+                <w:color w:val="000000"/>
+                <w:sz w:val="18"/>
+                <w:szCs w:val="18"/>
+              </w:rPr>
+            </w:pPr>
+            <w:r>
+              <w:rPr>
+                <w:color w:val="000000"/>
+                <w:sz w:val="18"/>
+                <w:szCs w:val="18"/>
               </w:rPr>
               <w:t>{student_1_school}</w:t>
             </w:r>
@@ -506,7 +501,7 @@
         </w:tc>
         <w:tc>
           <w:tcPr>
-            <w:tcW w:w="555" w:type="pct"/>
+            <w:tcW w:w="547" w:type="pct"/>
           </w:tcPr>
           <w:p>
             <w:pPr>
@@ -542,7 +537,7 @@
         </w:trPr>
         <w:tc>
           <w:tcPr>
-            <w:tcW w:w="217" w:type="pct"/>
+            <w:tcW w:w="209" w:type="pct"/>
           </w:tcPr>
           <w:p>
             <w:pPr>
@@ -567,7 +562,7 @@
         </w:tc>
         <w:tc>
           <w:tcPr>
-            <w:tcW w:w="1534" w:type="pct"/>
+            <w:tcW w:w="1608" w:type="pct"/>
           </w:tcPr>
           <w:p>
             <w:pPr>
@@ -593,24 +588,24 @@
         </w:tc>
         <w:tc>
           <w:tcPr>
-            <w:tcW w:w="1093" w:type="pct"/>
-          </w:tcPr>
-          <w:p>
-            <w:pPr>
-              <w:jc w:val="center"/>
-              <w:rPr>
-                <w:rFonts w:ascii="Arial" w:hAnsi="Arial" w:cs="Arial"/>
-                <w:color w:val="000000"/>
-                <w:sz w:val="20"/>
-                <w:szCs w:val="20"/>
-              </w:rPr>
-            </w:pPr>
-            <w:r>
-              <w:rPr>
-                <w:rFonts w:ascii="Arial" w:hAnsi="Arial" w:cs="Arial"/>
-                <w:color w:val="000000"/>
-                <w:sz w:val="20"/>
-                <w:szCs w:val="20"/>
+            <w:tcW w:w="925" w:type="pct"/>
+          </w:tcPr>
+          <w:p>
+            <w:pPr>
+              <w:jc w:val="center"/>
+              <w:rPr>
+                <w:rFonts w:ascii="Arial" w:hAnsi="Arial" w:cs="Arial"/>
+                <w:color w:val="000000"/>
+                <w:sz w:val="18"/>
+                <w:szCs w:val="18"/>
+              </w:rPr>
+            </w:pPr>
+            <w:r>
+              <w:rPr>
+                <w:rFonts w:ascii="Arial" w:hAnsi="Arial" w:cs="Arial"/>
+                <w:color w:val="000000"/>
+                <w:sz w:val="18"/>
+                <w:szCs w:val="18"/>
               </w:rPr>
               <w:t>{student_2_year_level}</w:t>
             </w:r>
@@ -618,22 +613,22 @@
         </w:tc>
         <w:tc>
           <w:tcPr>
-            <w:tcW w:w="1600" w:type="pct"/>
-          </w:tcPr>
-          <w:p>
-            <w:pPr>
-              <w:jc w:val="center"/>
-              <w:rPr>
-                <w:color w:val="000000"/>
-                <w:sz w:val="20"/>
-                <w:szCs w:val="20"/>
-              </w:rPr>
-            </w:pPr>
-            <w:r>
-              <w:rPr>
-                <w:color w:val="000000"/>
-                <w:sz w:val="20"/>
-                <w:szCs w:val="20"/>
+            <w:tcW w:w="1708" w:type="pct"/>
+          </w:tcPr>
+          <w:p>
+            <w:pPr>
+              <w:jc w:val="center"/>
+              <w:rPr>
+                <w:color w:val="000000"/>
+                <w:sz w:val="18"/>
+                <w:szCs w:val="18"/>
+              </w:rPr>
+            </w:pPr>
+            <w:r>
+              <w:rPr>
+                <w:color w:val="000000"/>
+                <w:sz w:val="18"/>
+                <w:szCs w:val="18"/>
               </w:rPr>
               <w:t>{student_2_school}</w:t>
             </w:r>
@@ -641,7 +636,7 @@
         </w:tc>
         <w:tc>
           <w:tcPr>
-            <w:tcW w:w="555" w:type="pct"/>
+            <w:tcW w:w="547" w:type="pct"/>
           </w:tcPr>
           <w:p>
             <w:pPr>
@@ -677,7 +672,7 @@
         </w:trPr>
         <w:tc>
           <w:tcPr>
-            <w:tcW w:w="217" w:type="pct"/>
+            <w:tcW w:w="209" w:type="pct"/>
           </w:tcPr>
           <w:p>
             <w:pPr>
@@ -702,7 +697,7 @@
         </w:tc>
         <w:tc>
           <w:tcPr>
-            <w:tcW w:w="1534" w:type="pct"/>
+            <w:tcW w:w="1608" w:type="pct"/>
           </w:tcPr>
           <w:p>
             <w:pPr>
@@ -728,24 +723,24 @@
         </w:tc>
         <w:tc>
           <w:tcPr>
-            <w:tcW w:w="1093" w:type="pct"/>
-          </w:tcPr>
-          <w:p>
-            <w:pPr>
-              <w:jc w:val="center"/>
-              <w:rPr>
-                <w:rFonts w:ascii="Arial" w:hAnsi="Arial" w:cs="Arial"/>
-                <w:color w:val="000000"/>
-                <w:sz w:val="20"/>
-                <w:szCs w:val="20"/>
-              </w:rPr>
-            </w:pPr>
-            <w:r>
-              <w:rPr>
-                <w:rFonts w:ascii="Arial" w:hAnsi="Arial" w:cs="Arial"/>
-                <w:color w:val="000000"/>
-                <w:sz w:val="20"/>
-                <w:szCs w:val="20"/>
+            <w:tcW w:w="925" w:type="pct"/>
+          </w:tcPr>
+          <w:p>
+            <w:pPr>
+              <w:jc w:val="center"/>
+              <w:rPr>
+                <w:rFonts w:ascii="Arial" w:hAnsi="Arial" w:cs="Arial"/>
+                <w:color w:val="000000"/>
+                <w:sz w:val="18"/>
+                <w:szCs w:val="18"/>
+              </w:rPr>
+            </w:pPr>
+            <w:r>
+              <w:rPr>
+                <w:rFonts w:ascii="Arial" w:hAnsi="Arial" w:cs="Arial"/>
+                <w:color w:val="000000"/>
+                <w:sz w:val="18"/>
+                <w:szCs w:val="18"/>
               </w:rPr>
               <w:t>{student_3_year_level}</w:t>
             </w:r>
@@ -753,22 +748,22 @@
         </w:tc>
         <w:tc>
           <w:tcPr>
-            <w:tcW w:w="1600" w:type="pct"/>
-          </w:tcPr>
-          <w:p>
-            <w:pPr>
-              <w:jc w:val="center"/>
-              <w:rPr>
-                <w:color w:val="000000"/>
-                <w:sz w:val="20"/>
-                <w:szCs w:val="20"/>
-              </w:rPr>
-            </w:pPr>
-            <w:r>
-              <w:rPr>
-                <w:color w:val="000000"/>
-                <w:sz w:val="20"/>
-                <w:szCs w:val="20"/>
+            <w:tcW w:w="1708" w:type="pct"/>
+          </w:tcPr>
+          <w:p>
+            <w:pPr>
+              <w:jc w:val="center"/>
+              <w:rPr>
+                <w:color w:val="000000"/>
+                <w:sz w:val="18"/>
+                <w:szCs w:val="18"/>
+              </w:rPr>
+            </w:pPr>
+            <w:r>
+              <w:rPr>
+                <w:color w:val="000000"/>
+                <w:sz w:val="18"/>
+                <w:szCs w:val="18"/>
               </w:rPr>
               <w:t>{student_3_school}</w:t>
             </w:r>
@@ -776,7 +771,7 @@
         </w:tc>
         <w:tc>
           <w:tcPr>
-            <w:tcW w:w="555" w:type="pct"/>
+            <w:tcW w:w="547" w:type="pct"/>
           </w:tcPr>
           <w:p>
             <w:pPr>
@@ -812,7 +807,7 @@
         </w:trPr>
         <w:tc>
           <w:tcPr>
-            <w:tcW w:w="217" w:type="pct"/>
+            <w:tcW w:w="209" w:type="pct"/>
           </w:tcPr>
           <w:p>
             <w:pPr>
@@ -837,7 +832,7 @@
         </w:tc>
         <w:tc>
           <w:tcPr>
-            <w:tcW w:w="1534" w:type="pct"/>
+            <w:tcW w:w="1608" w:type="pct"/>
           </w:tcPr>
           <w:p>
             <w:pPr>
@@ -863,24 +858,24 @@
         </w:tc>
         <w:tc>
           <w:tcPr>
-            <w:tcW w:w="1093" w:type="pct"/>
-          </w:tcPr>
-          <w:p>
-            <w:pPr>
-              <w:jc w:val="center"/>
-              <w:rPr>
-                <w:rFonts w:ascii="Arial" w:hAnsi="Arial" w:cs="Arial"/>
-                <w:color w:val="000000"/>
-                <w:sz w:val="20"/>
-                <w:szCs w:val="20"/>
-              </w:rPr>
-            </w:pPr>
-            <w:r>
-              <w:rPr>
-                <w:rFonts w:ascii="Arial" w:hAnsi="Arial" w:cs="Arial"/>
-                <w:color w:val="000000"/>
-                <w:sz w:val="20"/>
-                <w:szCs w:val="20"/>
+            <w:tcW w:w="925" w:type="pct"/>
+          </w:tcPr>
+          <w:p>
+            <w:pPr>
+              <w:jc w:val="center"/>
+              <w:rPr>
+                <w:rFonts w:ascii="Arial" w:hAnsi="Arial" w:cs="Arial"/>
+                <w:color w:val="000000"/>
+                <w:sz w:val="18"/>
+                <w:szCs w:val="18"/>
+              </w:rPr>
+            </w:pPr>
+            <w:r>
+              <w:rPr>
+                <w:rFonts w:ascii="Arial" w:hAnsi="Arial" w:cs="Arial"/>
+                <w:color w:val="000000"/>
+                <w:sz w:val="18"/>
+                <w:szCs w:val="18"/>
               </w:rPr>
               <w:t>{student_4_year_level}</w:t>
             </w:r>
@@ -888,22 +883,22 @@
         </w:tc>
         <w:tc>
           <w:tcPr>
-            <w:tcW w:w="1600" w:type="pct"/>
-          </w:tcPr>
-          <w:p>
-            <w:pPr>
-              <w:jc w:val="center"/>
-              <w:rPr>
-                <w:color w:val="000000"/>
-                <w:sz w:val="20"/>
-                <w:szCs w:val="20"/>
-              </w:rPr>
-            </w:pPr>
-            <w:r>
-              <w:rPr>
-                <w:color w:val="000000"/>
-                <w:sz w:val="20"/>
-                <w:szCs w:val="20"/>
+            <w:tcW w:w="1708" w:type="pct"/>
+          </w:tcPr>
+          <w:p>
+            <w:pPr>
+              <w:jc w:val="center"/>
+              <w:rPr>
+                <w:color w:val="000000"/>
+                <w:sz w:val="18"/>
+                <w:szCs w:val="18"/>
+              </w:rPr>
+            </w:pPr>
+            <w:r>
+              <w:rPr>
+                <w:color w:val="000000"/>
+                <w:sz w:val="18"/>
+                <w:szCs w:val="18"/>
               </w:rPr>
               <w:t>{student_4_school}</w:t>
             </w:r>
@@ -911,7 +906,7 @@
         </w:tc>
         <w:tc>
           <w:tcPr>
-            <w:tcW w:w="555" w:type="pct"/>
+            <w:tcW w:w="547" w:type="pct"/>
           </w:tcPr>
           <w:p>
             <w:pPr>
@@ -947,7 +942,7 @@
         </w:trPr>
         <w:tc>
           <w:tcPr>
-            <w:tcW w:w="217" w:type="pct"/>
+            <w:tcW w:w="209" w:type="pct"/>
           </w:tcPr>
           <w:p>
             <w:pPr>
@@ -972,7 +967,7 @@
         </w:tc>
         <w:tc>
           <w:tcPr>
-            <w:tcW w:w="1534" w:type="pct"/>
+            <w:tcW w:w="1608" w:type="pct"/>
           </w:tcPr>
           <w:p>
             <w:pPr>
@@ -998,24 +993,24 @@
         </w:tc>
         <w:tc>
           <w:tcPr>
-            <w:tcW w:w="1093" w:type="pct"/>
-          </w:tcPr>
-          <w:p>
-            <w:pPr>
-              <w:jc w:val="center"/>
-              <w:rPr>
-                <w:rFonts w:ascii="Arial" w:hAnsi="Arial" w:cs="Arial"/>
-                <w:color w:val="000000"/>
-                <w:sz w:val="20"/>
-                <w:szCs w:val="20"/>
-              </w:rPr>
-            </w:pPr>
-            <w:r>
-              <w:rPr>
-                <w:rFonts w:ascii="Arial" w:hAnsi="Arial" w:cs="Arial"/>
-                <w:color w:val="000000"/>
-                <w:sz w:val="20"/>
-                <w:szCs w:val="20"/>
+            <w:tcW w:w="925" w:type="pct"/>
+          </w:tcPr>
+          <w:p>
+            <w:pPr>
+              <w:jc w:val="center"/>
+              <w:rPr>
+                <w:rFonts w:ascii="Arial" w:hAnsi="Arial" w:cs="Arial"/>
+                <w:color w:val="000000"/>
+                <w:sz w:val="18"/>
+                <w:szCs w:val="18"/>
+              </w:rPr>
+            </w:pPr>
+            <w:r>
+              <w:rPr>
+                <w:rFonts w:ascii="Arial" w:hAnsi="Arial" w:cs="Arial"/>
+                <w:color w:val="000000"/>
+                <w:sz w:val="18"/>
+                <w:szCs w:val="18"/>
               </w:rPr>
               <w:t>{student_5_year_level}</w:t>
             </w:r>
@@ -1023,22 +1018,22 @@
         </w:tc>
         <w:tc>
           <w:tcPr>
-            <w:tcW w:w="1600" w:type="pct"/>
-          </w:tcPr>
-          <w:p>
-            <w:pPr>
-              <w:jc w:val="center"/>
-              <w:rPr>
-                <w:color w:val="000000"/>
-                <w:sz w:val="20"/>
-                <w:szCs w:val="20"/>
-              </w:rPr>
-            </w:pPr>
-            <w:r>
-              <w:rPr>
-                <w:color w:val="000000"/>
-                <w:sz w:val="20"/>
-                <w:szCs w:val="20"/>
+            <w:tcW w:w="1708" w:type="pct"/>
+          </w:tcPr>
+          <w:p>
+            <w:pPr>
+              <w:jc w:val="center"/>
+              <w:rPr>
+                <w:color w:val="000000"/>
+                <w:sz w:val="18"/>
+                <w:szCs w:val="18"/>
+              </w:rPr>
+            </w:pPr>
+            <w:r>
+              <w:rPr>
+                <w:color w:val="000000"/>
+                <w:sz w:val="18"/>
+                <w:szCs w:val="18"/>
               </w:rPr>
               <w:t>{student_5_school}</w:t>
             </w:r>
@@ -1046,7 +1041,7 @@
         </w:tc>
         <w:tc>
           <w:tcPr>
-            <w:tcW w:w="555" w:type="pct"/>
+            <w:tcW w:w="547" w:type="pct"/>
           </w:tcPr>
           <w:p>
             <w:pPr>
@@ -1082,7 +1077,7 @@
         </w:trPr>
         <w:tc>
           <w:tcPr>
-            <w:tcW w:w="217" w:type="pct"/>
+            <w:tcW w:w="209" w:type="pct"/>
           </w:tcPr>
           <w:p>
             <w:pPr>
@@ -1107,7 +1102,7 @@
         </w:tc>
         <w:tc>
           <w:tcPr>
-            <w:tcW w:w="1534" w:type="pct"/>
+            <w:tcW w:w="1608" w:type="pct"/>
           </w:tcPr>
           <w:p>
             <w:pPr>
@@ -1133,24 +1128,24 @@
         </w:tc>
         <w:tc>
           <w:tcPr>
-            <w:tcW w:w="1093" w:type="pct"/>
-          </w:tcPr>
-          <w:p>
-            <w:pPr>
-              <w:jc w:val="center"/>
-              <w:rPr>
-                <w:rFonts w:ascii="Arial" w:hAnsi="Arial" w:cs="Arial"/>
-                <w:color w:val="000000"/>
-                <w:sz w:val="20"/>
-                <w:szCs w:val="20"/>
-              </w:rPr>
-            </w:pPr>
-            <w:r>
-              <w:rPr>
-                <w:rFonts w:ascii="Arial" w:hAnsi="Arial" w:cs="Arial"/>
-                <w:color w:val="000000"/>
-                <w:sz w:val="20"/>
-                <w:szCs w:val="20"/>
+            <w:tcW w:w="925" w:type="pct"/>
+          </w:tcPr>
+          <w:p>
+            <w:pPr>
+              <w:jc w:val="center"/>
+              <w:rPr>
+                <w:rFonts w:ascii="Arial" w:hAnsi="Arial" w:cs="Arial"/>
+                <w:color w:val="000000"/>
+                <w:sz w:val="18"/>
+                <w:szCs w:val="18"/>
+              </w:rPr>
+            </w:pPr>
+            <w:r>
+              <w:rPr>
+                <w:rFonts w:ascii="Arial" w:hAnsi="Arial" w:cs="Arial"/>
+                <w:color w:val="000000"/>
+                <w:sz w:val="18"/>
+                <w:szCs w:val="18"/>
               </w:rPr>
               <w:t>{student_6_year_level}</w:t>
             </w:r>
@@ -1158,22 +1153,22 @@
         </w:tc>
         <w:tc>
           <w:tcPr>
-            <w:tcW w:w="1600" w:type="pct"/>
-          </w:tcPr>
-          <w:p>
-            <w:pPr>
-              <w:jc w:val="center"/>
-              <w:rPr>
-                <w:color w:val="000000"/>
-                <w:sz w:val="20"/>
-                <w:szCs w:val="20"/>
-              </w:rPr>
-            </w:pPr>
-            <w:r>
-              <w:rPr>
-                <w:color w:val="000000"/>
-                <w:sz w:val="20"/>
-                <w:szCs w:val="20"/>
+            <w:tcW w:w="1708" w:type="pct"/>
+          </w:tcPr>
+          <w:p>
+            <w:pPr>
+              <w:jc w:val="center"/>
+              <w:rPr>
+                <w:color w:val="000000"/>
+                <w:sz w:val="18"/>
+                <w:szCs w:val="18"/>
+              </w:rPr>
+            </w:pPr>
+            <w:r>
+              <w:rPr>
+                <w:color w:val="000000"/>
+                <w:sz w:val="18"/>
+                <w:szCs w:val="18"/>
               </w:rPr>
               <w:t>{student_6_school}</w:t>
             </w:r>
@@ -1181,7 +1176,7 @@
         </w:tc>
         <w:tc>
           <w:tcPr>
-            <w:tcW w:w="555" w:type="pct"/>
+            <w:tcW w:w="547" w:type="pct"/>
           </w:tcPr>
           <w:p>
             <w:pPr>
@@ -1217,7 +1212,7 @@
         </w:trPr>
         <w:tc>
           <w:tcPr>
-            <w:tcW w:w="217" w:type="pct"/>
+            <w:tcW w:w="209" w:type="pct"/>
           </w:tcPr>
           <w:p>
             <w:pPr>
@@ -1242,7 +1237,7 @@
         </w:tc>
         <w:tc>
           <w:tcPr>
-            <w:tcW w:w="1534" w:type="pct"/>
+            <w:tcW w:w="1608" w:type="pct"/>
           </w:tcPr>
           <w:p>
             <w:pPr>
@@ -1268,24 +1263,24 @@
         </w:tc>
         <w:tc>
           <w:tcPr>
-            <w:tcW w:w="1093" w:type="pct"/>
-          </w:tcPr>
-          <w:p>
-            <w:pPr>
-              <w:jc w:val="center"/>
-              <w:rPr>
-                <w:rFonts w:ascii="Arial" w:hAnsi="Arial" w:cs="Arial"/>
-                <w:color w:val="000000"/>
-                <w:sz w:val="20"/>
-                <w:szCs w:val="20"/>
-              </w:rPr>
-            </w:pPr>
-            <w:r>
-              <w:rPr>
-                <w:rFonts w:ascii="Arial" w:hAnsi="Arial" w:cs="Arial"/>
-                <w:color w:val="000000"/>
-                <w:sz w:val="20"/>
-                <w:szCs w:val="20"/>
+            <w:tcW w:w="925" w:type="pct"/>
+          </w:tcPr>
+          <w:p>
+            <w:pPr>
+              <w:jc w:val="center"/>
+              <w:rPr>
+                <w:rFonts w:ascii="Arial" w:hAnsi="Arial" w:cs="Arial"/>
+                <w:color w:val="000000"/>
+                <w:sz w:val="18"/>
+                <w:szCs w:val="18"/>
+              </w:rPr>
+            </w:pPr>
+            <w:r>
+              <w:rPr>
+                <w:rFonts w:ascii="Arial" w:hAnsi="Arial" w:cs="Arial"/>
+                <w:color w:val="000000"/>
+                <w:sz w:val="18"/>
+                <w:szCs w:val="18"/>
               </w:rPr>
               <w:t>{student_7_year_level}</w:t>
             </w:r>
@@ -1293,22 +1288,22 @@
         </w:tc>
         <w:tc>
           <w:tcPr>
-            <w:tcW w:w="1600" w:type="pct"/>
-          </w:tcPr>
-          <w:p>
-            <w:pPr>
-              <w:jc w:val="center"/>
-              <w:rPr>
-                <w:color w:val="000000"/>
-                <w:sz w:val="20"/>
-                <w:szCs w:val="20"/>
-              </w:rPr>
-            </w:pPr>
-            <w:r>
-              <w:rPr>
-                <w:color w:val="000000"/>
-                <w:sz w:val="20"/>
-                <w:szCs w:val="20"/>
+            <w:tcW w:w="1708" w:type="pct"/>
+          </w:tcPr>
+          <w:p>
+            <w:pPr>
+              <w:jc w:val="center"/>
+              <w:rPr>
+                <w:color w:val="000000"/>
+                <w:sz w:val="18"/>
+                <w:szCs w:val="18"/>
+              </w:rPr>
+            </w:pPr>
+            <w:r>
+              <w:rPr>
+                <w:color w:val="000000"/>
+                <w:sz w:val="18"/>
+                <w:szCs w:val="18"/>
               </w:rPr>
               <w:t>{student_7_school}</w:t>
             </w:r>
@@ -1316,7 +1311,7 @@
         </w:tc>
         <w:tc>
           <w:tcPr>
-            <w:tcW w:w="555" w:type="pct"/>
+            <w:tcW w:w="547" w:type="pct"/>
           </w:tcPr>
           <w:p>
             <w:pPr>
@@ -1352,7 +1347,7 @@
         </w:trPr>
         <w:tc>
           <w:tcPr>
-            <w:tcW w:w="217" w:type="pct"/>
+            <w:tcW w:w="209" w:type="pct"/>
           </w:tcPr>
           <w:p>
             <w:pPr>
@@ -1377,7 +1372,7 @@
         </w:tc>
         <w:tc>
           <w:tcPr>
-            <w:tcW w:w="1534" w:type="pct"/>
+            <w:tcW w:w="1608" w:type="pct"/>
           </w:tcPr>
           <w:p>
             <w:pPr>
@@ -1403,24 +1398,24 @@
         </w:tc>
         <w:tc>
           <w:tcPr>
-            <w:tcW w:w="1093" w:type="pct"/>
-          </w:tcPr>
-          <w:p>
-            <w:pPr>
-              <w:jc w:val="center"/>
-              <w:rPr>
-                <w:rFonts w:ascii="Arial" w:hAnsi="Arial" w:cs="Arial"/>
-                <w:color w:val="000000"/>
-                <w:sz w:val="20"/>
-                <w:szCs w:val="20"/>
-              </w:rPr>
-            </w:pPr>
-            <w:r>
-              <w:rPr>
-                <w:rFonts w:ascii="Arial" w:hAnsi="Arial" w:cs="Arial"/>
-                <w:color w:val="000000"/>
-                <w:sz w:val="20"/>
-                <w:szCs w:val="20"/>
+            <w:tcW w:w="925" w:type="pct"/>
+          </w:tcPr>
+          <w:p>
+            <w:pPr>
+              <w:jc w:val="center"/>
+              <w:rPr>
+                <w:rFonts w:ascii="Arial" w:hAnsi="Arial" w:cs="Arial"/>
+                <w:color w:val="000000"/>
+                <w:sz w:val="18"/>
+                <w:szCs w:val="18"/>
+              </w:rPr>
+            </w:pPr>
+            <w:r>
+              <w:rPr>
+                <w:rFonts w:ascii="Arial" w:hAnsi="Arial" w:cs="Arial"/>
+                <w:color w:val="000000"/>
+                <w:sz w:val="18"/>
+                <w:szCs w:val="18"/>
               </w:rPr>
               <w:t>{student_8_year_level}</w:t>
             </w:r>
@@ -1428,22 +1423,22 @@
         </w:tc>
         <w:tc>
           <w:tcPr>
-            <w:tcW w:w="1600" w:type="pct"/>
-          </w:tcPr>
-          <w:p>
-            <w:pPr>
-              <w:jc w:val="center"/>
-              <w:rPr>
-                <w:color w:val="000000"/>
-                <w:sz w:val="20"/>
-                <w:szCs w:val="20"/>
-              </w:rPr>
-            </w:pPr>
-            <w:r>
-              <w:rPr>
-                <w:color w:val="000000"/>
-                <w:sz w:val="20"/>
-                <w:szCs w:val="20"/>
+            <w:tcW w:w="1708" w:type="pct"/>
+          </w:tcPr>
+          <w:p>
+            <w:pPr>
+              <w:jc w:val="center"/>
+              <w:rPr>
+                <w:color w:val="000000"/>
+                <w:sz w:val="18"/>
+                <w:szCs w:val="18"/>
+              </w:rPr>
+            </w:pPr>
+            <w:r>
+              <w:rPr>
+                <w:color w:val="000000"/>
+                <w:sz w:val="18"/>
+                <w:szCs w:val="18"/>
               </w:rPr>
               <w:t>{student_8_school}</w:t>
             </w:r>
@@ -1451,7 +1446,7 @@
         </w:tc>
         <w:tc>
           <w:tcPr>
-            <w:tcW w:w="555" w:type="pct"/>
+            <w:tcW w:w="547" w:type="pct"/>
           </w:tcPr>
           <w:p>
             <w:pPr>
@@ -1469,133 +1464,6 @@
                 <w:szCs w:val="20"/>
               </w:rPr>
               <w:t>{passed_8}</w:t>
-            </w:r>
-          </w:p>
-        </w:tc>
-      </w:tr>
-      <w:tr>
-        <w:trPr>
-          <w:trHeight w:val="258" w:hRule="atLeast"/>
-        </w:trPr>
-        <w:tc>
-          <w:tcPr>
-            <w:tcW w:w="217" w:type="pct"/>
-          </w:tcPr>
-          <w:p>
-            <w:pPr>
-              <w:jc w:val="right"/>
-              <w:rPr>
-                <w:rFonts w:ascii="Arial" w:hAnsi="Arial" w:cs="Arial"/>
-                <w:color w:val="000000"/>
-                <w:sz w:val="20"/>
-                <w:szCs w:val="20"/>
-              </w:rPr>
-            </w:pPr>
-            <w:r>
-              <w:rPr>
-                <w:rFonts w:ascii="Arial" w:hAnsi="Arial" w:cs="Arial"/>
-                <w:color w:val="000000"/>
-                <w:sz w:val="20"/>
-                <w:szCs w:val="20"/>
-              </w:rPr>
-              <w:t>9</w:t>
-            </w:r>
-          </w:p>
-        </w:tc>
-        <w:tc>
-          <w:tcPr>
-            <w:tcW w:w="1534" w:type="pct"/>
-          </w:tcPr>
-          <w:p>
-            <w:pPr>
-              <w:rPr>
-                <w:rFonts w:ascii="Arial" w:hAnsi="Arial" w:cs="Arial"/>
-                <w:color w:val="000000"/>
-                <w:sz w:val="20"/>
-                <w:szCs w:val="20"/>
-                <w:lang w:eastAsia="en-PH"/>
-              </w:rPr>
-            </w:pPr>
-            <w:r>
-              <w:rPr>
-                <w:rFonts w:ascii="Arial" w:hAnsi="Arial" w:cs="Arial"/>
-                <w:color w:val="000000"/>
-                <w:sz w:val="20"/>
-                <w:szCs w:val="20"/>
-                <w:lang w:eastAsia="en-PH"/>
-              </w:rPr>
-              <w:t>{student_9_fname}</w:t>
-            </w:r>
-          </w:p>
-        </w:tc>
-        <w:tc>
-          <w:tcPr>
-            <w:tcW w:w="1093" w:type="pct"/>
-          </w:tcPr>
-          <w:p>
-            <w:pPr>
-              <w:jc w:val="center"/>
-              <w:rPr>
-                <w:rFonts w:ascii="Arial" w:hAnsi="Arial" w:cs="Arial"/>
-                <w:color w:val="000000"/>
-                <w:sz w:val="20"/>
-                <w:szCs w:val="20"/>
-              </w:rPr>
-            </w:pPr>
-            <w:r>
-              <w:rPr>
-                <w:rFonts w:ascii="Arial" w:hAnsi="Arial" w:cs="Arial"/>
-                <w:color w:val="000000"/>
-                <w:sz w:val="20"/>
-                <w:szCs w:val="20"/>
-              </w:rPr>
-              <w:t>{student_9_year_level}</w:t>
-            </w:r>
-          </w:p>
-        </w:tc>
-        <w:tc>
-          <w:tcPr>
-            <w:tcW w:w="1600" w:type="pct"/>
-          </w:tcPr>
-          <w:p>
-            <w:pPr>
-              <w:jc w:val="center"/>
-              <w:rPr>
-                <w:color w:val="000000"/>
-                <w:sz w:val="20"/>
-                <w:szCs w:val="20"/>
-              </w:rPr>
-            </w:pPr>
-            <w:r>
-              <w:rPr>
-                <w:color w:val="000000"/>
-                <w:sz w:val="20"/>
-                <w:szCs w:val="20"/>
-              </w:rPr>
-              <w:t>{student_9_school}</w:t>
-            </w:r>
-          </w:p>
-        </w:tc>
-        <w:tc>
-          <w:tcPr>
-            <w:tcW w:w="555" w:type="pct"/>
-          </w:tcPr>
-          <w:p>
-            <w:pPr>
-              <w:jc w:val="center"/>
-              <w:rPr>
-                <w:color w:val="000000"/>
-                <w:sz w:val="20"/>
-                <w:szCs w:val="20"/>
-              </w:rPr>
-            </w:pPr>
-            <w:r>
-              <w:rPr>
-                <w:color w:val="000000"/>
-                <w:sz w:val="20"/>
-                <w:szCs w:val="20"/>
-              </w:rPr>
-              <w:t>{passed_9}</w:t>
             </w:r>
           </w:p>
         </w:tc>
@@ -1614,7 +1482,7 @@
         </w:trPr>
         <w:tc>
           <w:tcPr>
-            <w:tcW w:w="217" w:type="pct"/>
+            <w:tcW w:w="209" w:type="pct"/>
           </w:tcPr>
           <w:p>
             <w:pPr>
@@ -1633,13 +1501,13 @@
                 <w:sz w:val="20"/>
                 <w:szCs w:val="20"/>
               </w:rPr>
-              <w:t>10</w:t>
-            </w:r>
-          </w:p>
-        </w:tc>
-        <w:tc>
-          <w:tcPr>
-            <w:tcW w:w="1534" w:type="pct"/>
+              <w:t>9</w:t>
+            </w:r>
+          </w:p>
+        </w:tc>
+        <w:tc>
+          <w:tcPr>
+            <w:tcW w:w="1608" w:type="pct"/>
           </w:tcPr>
           <w:p>
             <w:pPr>
@@ -1659,78 +1527,78 @@
                 <w:szCs w:val="20"/>
                 <w:lang w:eastAsia="en-PH"/>
               </w:rPr>
-              <w:t>{student_10_fname}</w:t>
-            </w:r>
-          </w:p>
-        </w:tc>
-        <w:tc>
-          <w:tcPr>
-            <w:tcW w:w="1093" w:type="pct"/>
-          </w:tcPr>
-          <w:p>
-            <w:pPr>
-              <w:jc w:val="center"/>
-              <w:rPr>
-                <w:rFonts w:ascii="Arial" w:hAnsi="Arial" w:cs="Arial"/>
-                <w:color w:val="000000"/>
-                <w:sz w:val="20"/>
-                <w:szCs w:val="20"/>
-              </w:rPr>
-            </w:pPr>
-            <w:r>
-              <w:rPr>
-                <w:rFonts w:ascii="Arial" w:hAnsi="Arial" w:cs="Arial"/>
-                <w:color w:val="000000"/>
-                <w:sz w:val="20"/>
-                <w:szCs w:val="20"/>
-              </w:rPr>
-              <w:t>{student_10_year_level}</w:t>
-            </w:r>
-          </w:p>
-        </w:tc>
-        <w:tc>
-          <w:tcPr>
-            <w:tcW w:w="1600" w:type="pct"/>
-          </w:tcPr>
-          <w:p>
-            <w:pPr>
-              <w:jc w:val="center"/>
-              <w:rPr>
-                <w:color w:val="000000"/>
-                <w:sz w:val="20"/>
-                <w:szCs w:val="20"/>
-              </w:rPr>
-            </w:pPr>
-            <w:r>
-              <w:rPr>
-                <w:color w:val="000000"/>
-                <w:sz w:val="20"/>
-                <w:szCs w:val="20"/>
-              </w:rPr>
-              <w:t>{student_10_school}</w:t>
-            </w:r>
-          </w:p>
-        </w:tc>
-        <w:tc>
-          <w:tcPr>
-            <w:tcW w:w="555" w:type="pct"/>
-          </w:tcPr>
-          <w:p>
-            <w:pPr>
-              <w:jc w:val="center"/>
-              <w:rPr>
-                <w:color w:val="000000"/>
-                <w:sz w:val="20"/>
-                <w:szCs w:val="20"/>
-              </w:rPr>
-            </w:pPr>
-            <w:r>
-              <w:rPr>
-                <w:color w:val="000000"/>
-                <w:sz w:val="20"/>
-                <w:szCs w:val="20"/>
-              </w:rPr>
-              <w:t>{passed_10}</w:t>
+              <w:t>{student_9_fname}</w:t>
+            </w:r>
+          </w:p>
+        </w:tc>
+        <w:tc>
+          <w:tcPr>
+            <w:tcW w:w="925" w:type="pct"/>
+          </w:tcPr>
+          <w:p>
+            <w:pPr>
+              <w:jc w:val="center"/>
+              <w:rPr>
+                <w:rFonts w:ascii="Arial" w:hAnsi="Arial" w:cs="Arial"/>
+                <w:color w:val="000000"/>
+                <w:sz w:val="18"/>
+                <w:szCs w:val="18"/>
+              </w:rPr>
+            </w:pPr>
+            <w:r>
+              <w:rPr>
+                <w:rFonts w:ascii="Arial" w:hAnsi="Arial" w:cs="Arial"/>
+                <w:color w:val="000000"/>
+                <w:sz w:val="18"/>
+                <w:szCs w:val="18"/>
+              </w:rPr>
+              <w:t>{student_9_year_level}</w:t>
+            </w:r>
+          </w:p>
+        </w:tc>
+        <w:tc>
+          <w:tcPr>
+            <w:tcW w:w="1708" w:type="pct"/>
+          </w:tcPr>
+          <w:p>
+            <w:pPr>
+              <w:jc w:val="center"/>
+              <w:rPr>
+                <w:color w:val="000000"/>
+                <w:sz w:val="18"/>
+                <w:szCs w:val="18"/>
+              </w:rPr>
+            </w:pPr>
+            <w:r>
+              <w:rPr>
+                <w:color w:val="000000"/>
+                <w:sz w:val="18"/>
+                <w:szCs w:val="18"/>
+              </w:rPr>
+              <w:t>{student_9_school}</w:t>
+            </w:r>
+          </w:p>
+        </w:tc>
+        <w:tc>
+          <w:tcPr>
+            <w:tcW w:w="547" w:type="pct"/>
+          </w:tcPr>
+          <w:p>
+            <w:pPr>
+              <w:jc w:val="center"/>
+              <w:rPr>
+                <w:color w:val="000000"/>
+                <w:sz w:val="20"/>
+                <w:szCs w:val="20"/>
+              </w:rPr>
+            </w:pPr>
+            <w:r>
+              <w:rPr>
+                <w:color w:val="000000"/>
+                <w:sz w:val="20"/>
+                <w:szCs w:val="20"/>
+              </w:rPr>
+              <w:t>{passed_9}</w:t>
             </w:r>
           </w:p>
         </w:tc>
@@ -1749,7 +1617,7 @@
         </w:trPr>
         <w:tc>
           <w:tcPr>
-            <w:tcW w:w="217" w:type="pct"/>
+            <w:tcW w:w="209" w:type="pct"/>
           </w:tcPr>
           <w:p>
             <w:pPr>
@@ -1768,13 +1636,13 @@
                 <w:sz w:val="20"/>
                 <w:szCs w:val="20"/>
               </w:rPr>
-              <w:t>11</w:t>
-            </w:r>
-          </w:p>
-        </w:tc>
-        <w:tc>
-          <w:tcPr>
-            <w:tcW w:w="1534" w:type="pct"/>
+              <w:t>10</w:t>
+            </w:r>
+          </w:p>
+        </w:tc>
+        <w:tc>
+          <w:tcPr>
+            <w:tcW w:w="1608" w:type="pct"/>
           </w:tcPr>
           <w:p>
             <w:pPr>
@@ -1794,78 +1662,78 @@
                 <w:szCs w:val="20"/>
                 <w:lang w:eastAsia="en-PH"/>
               </w:rPr>
-              <w:t>{student_11_fname}</w:t>
-            </w:r>
-          </w:p>
-        </w:tc>
-        <w:tc>
-          <w:tcPr>
-            <w:tcW w:w="1093" w:type="pct"/>
-          </w:tcPr>
-          <w:p>
-            <w:pPr>
-              <w:jc w:val="center"/>
-              <w:rPr>
-                <w:rFonts w:ascii="Arial" w:hAnsi="Arial" w:cs="Arial"/>
-                <w:color w:val="000000"/>
-                <w:sz w:val="20"/>
-                <w:szCs w:val="20"/>
-              </w:rPr>
-            </w:pPr>
-            <w:r>
-              <w:rPr>
-                <w:rFonts w:ascii="Arial" w:hAnsi="Arial" w:cs="Arial"/>
-                <w:color w:val="000000"/>
-                <w:sz w:val="20"/>
-                <w:szCs w:val="20"/>
-              </w:rPr>
-              <w:t>{student_11_year_level}</w:t>
-            </w:r>
-          </w:p>
-        </w:tc>
-        <w:tc>
-          <w:tcPr>
-            <w:tcW w:w="1600" w:type="pct"/>
-          </w:tcPr>
-          <w:p>
-            <w:pPr>
-              <w:jc w:val="center"/>
-              <w:rPr>
-                <w:color w:val="000000"/>
-                <w:sz w:val="20"/>
-                <w:szCs w:val="20"/>
-              </w:rPr>
-            </w:pPr>
-            <w:r>
-              <w:rPr>
-                <w:color w:val="000000"/>
-                <w:sz w:val="20"/>
-                <w:szCs w:val="20"/>
-              </w:rPr>
-              <w:t>{student_11_school}</w:t>
-            </w:r>
-          </w:p>
-        </w:tc>
-        <w:tc>
-          <w:tcPr>
-            <w:tcW w:w="555" w:type="pct"/>
-          </w:tcPr>
-          <w:p>
-            <w:pPr>
-              <w:jc w:val="center"/>
-              <w:rPr>
-                <w:color w:val="000000"/>
-                <w:sz w:val="20"/>
-                <w:szCs w:val="20"/>
-              </w:rPr>
-            </w:pPr>
-            <w:r>
-              <w:rPr>
-                <w:color w:val="000000"/>
-                <w:sz w:val="20"/>
-                <w:szCs w:val="20"/>
-              </w:rPr>
-              <w:t>{passed_11}</w:t>
+              <w:t>{student_10_fname}</w:t>
+            </w:r>
+          </w:p>
+        </w:tc>
+        <w:tc>
+          <w:tcPr>
+            <w:tcW w:w="925" w:type="pct"/>
+          </w:tcPr>
+          <w:p>
+            <w:pPr>
+              <w:jc w:val="center"/>
+              <w:rPr>
+                <w:rFonts w:ascii="Arial" w:hAnsi="Arial" w:cs="Arial"/>
+                <w:color w:val="000000"/>
+                <w:sz w:val="18"/>
+                <w:szCs w:val="18"/>
+              </w:rPr>
+            </w:pPr>
+            <w:r>
+              <w:rPr>
+                <w:rFonts w:ascii="Arial" w:hAnsi="Arial" w:cs="Arial"/>
+                <w:color w:val="000000"/>
+                <w:sz w:val="18"/>
+                <w:szCs w:val="18"/>
+              </w:rPr>
+              <w:t>{student_10_year_level}</w:t>
+            </w:r>
+          </w:p>
+        </w:tc>
+        <w:tc>
+          <w:tcPr>
+            <w:tcW w:w="1708" w:type="pct"/>
+          </w:tcPr>
+          <w:p>
+            <w:pPr>
+              <w:jc w:val="center"/>
+              <w:rPr>
+                <w:color w:val="000000"/>
+                <w:sz w:val="18"/>
+                <w:szCs w:val="18"/>
+              </w:rPr>
+            </w:pPr>
+            <w:r>
+              <w:rPr>
+                <w:color w:val="000000"/>
+                <w:sz w:val="18"/>
+                <w:szCs w:val="18"/>
+              </w:rPr>
+              <w:t>{student_10_school}</w:t>
+            </w:r>
+          </w:p>
+        </w:tc>
+        <w:tc>
+          <w:tcPr>
+            <w:tcW w:w="547" w:type="pct"/>
+          </w:tcPr>
+          <w:p>
+            <w:pPr>
+              <w:jc w:val="center"/>
+              <w:rPr>
+                <w:color w:val="000000"/>
+                <w:sz w:val="20"/>
+                <w:szCs w:val="20"/>
+              </w:rPr>
+            </w:pPr>
+            <w:r>
+              <w:rPr>
+                <w:color w:val="000000"/>
+                <w:sz w:val="20"/>
+                <w:szCs w:val="20"/>
+              </w:rPr>
+              <w:t>{passed_10}</w:t>
             </w:r>
           </w:p>
         </w:tc>
@@ -1884,7 +1752,7 @@
         </w:trPr>
         <w:tc>
           <w:tcPr>
-            <w:tcW w:w="217" w:type="pct"/>
+            <w:tcW w:w="209" w:type="pct"/>
           </w:tcPr>
           <w:p>
             <w:pPr>
@@ -1903,13 +1771,13 @@
                 <w:sz w:val="20"/>
                 <w:szCs w:val="20"/>
               </w:rPr>
-              <w:t>12</w:t>
-            </w:r>
-          </w:p>
-        </w:tc>
-        <w:tc>
-          <w:tcPr>
-            <w:tcW w:w="1534" w:type="pct"/>
+              <w:t>11</w:t>
+            </w:r>
+          </w:p>
+        </w:tc>
+        <w:tc>
+          <w:tcPr>
+            <w:tcW w:w="1608" w:type="pct"/>
           </w:tcPr>
           <w:p>
             <w:pPr>
@@ -1929,78 +1797,78 @@
                 <w:szCs w:val="20"/>
                 <w:lang w:eastAsia="en-PH"/>
               </w:rPr>
-              <w:t>{student_12_fname}</w:t>
-            </w:r>
-          </w:p>
-        </w:tc>
-        <w:tc>
-          <w:tcPr>
-            <w:tcW w:w="1093" w:type="pct"/>
-          </w:tcPr>
-          <w:p>
-            <w:pPr>
-              <w:jc w:val="center"/>
-              <w:rPr>
-                <w:rFonts w:ascii="Arial" w:hAnsi="Arial" w:cs="Arial"/>
-                <w:color w:val="000000"/>
-                <w:sz w:val="20"/>
-                <w:szCs w:val="20"/>
-              </w:rPr>
-            </w:pPr>
-            <w:r>
-              <w:rPr>
-                <w:rFonts w:ascii="Arial" w:hAnsi="Arial" w:cs="Arial"/>
-                <w:color w:val="000000"/>
-                <w:sz w:val="20"/>
-                <w:szCs w:val="20"/>
-              </w:rPr>
-              <w:t>{student_12_year_level}</w:t>
-            </w:r>
-          </w:p>
-        </w:tc>
-        <w:tc>
-          <w:tcPr>
-            <w:tcW w:w="1600" w:type="pct"/>
-          </w:tcPr>
-          <w:p>
-            <w:pPr>
-              <w:jc w:val="center"/>
-              <w:rPr>
-                <w:color w:val="000000"/>
-                <w:sz w:val="20"/>
-                <w:szCs w:val="20"/>
-              </w:rPr>
-            </w:pPr>
-            <w:r>
-              <w:rPr>
-                <w:color w:val="000000"/>
-                <w:sz w:val="20"/>
-                <w:szCs w:val="20"/>
-              </w:rPr>
-              <w:t>{student_12_school}</w:t>
-            </w:r>
-          </w:p>
-        </w:tc>
-        <w:tc>
-          <w:tcPr>
-            <w:tcW w:w="555" w:type="pct"/>
-          </w:tcPr>
-          <w:p>
-            <w:pPr>
-              <w:jc w:val="center"/>
-              <w:rPr>
-                <w:color w:val="000000"/>
-                <w:sz w:val="20"/>
-                <w:szCs w:val="20"/>
-              </w:rPr>
-            </w:pPr>
-            <w:r>
-              <w:rPr>
-                <w:color w:val="000000"/>
-                <w:sz w:val="20"/>
-                <w:szCs w:val="20"/>
-              </w:rPr>
-              <w:t>{passed_12}</w:t>
+              <w:t>{student_11_fname}</w:t>
+            </w:r>
+          </w:p>
+        </w:tc>
+        <w:tc>
+          <w:tcPr>
+            <w:tcW w:w="925" w:type="pct"/>
+          </w:tcPr>
+          <w:p>
+            <w:pPr>
+              <w:jc w:val="center"/>
+              <w:rPr>
+                <w:rFonts w:ascii="Arial" w:hAnsi="Arial" w:cs="Arial"/>
+                <w:color w:val="000000"/>
+                <w:sz w:val="18"/>
+                <w:szCs w:val="18"/>
+              </w:rPr>
+            </w:pPr>
+            <w:r>
+              <w:rPr>
+                <w:rFonts w:ascii="Arial" w:hAnsi="Arial" w:cs="Arial"/>
+                <w:color w:val="000000"/>
+                <w:sz w:val="18"/>
+                <w:szCs w:val="18"/>
+              </w:rPr>
+              <w:t>{student_11_year_level}</w:t>
+            </w:r>
+          </w:p>
+        </w:tc>
+        <w:tc>
+          <w:tcPr>
+            <w:tcW w:w="1708" w:type="pct"/>
+          </w:tcPr>
+          <w:p>
+            <w:pPr>
+              <w:jc w:val="center"/>
+              <w:rPr>
+                <w:color w:val="000000"/>
+                <w:sz w:val="18"/>
+                <w:szCs w:val="18"/>
+              </w:rPr>
+            </w:pPr>
+            <w:r>
+              <w:rPr>
+                <w:color w:val="000000"/>
+                <w:sz w:val="18"/>
+                <w:szCs w:val="18"/>
+              </w:rPr>
+              <w:t>{student_11_school}</w:t>
+            </w:r>
+          </w:p>
+        </w:tc>
+        <w:tc>
+          <w:tcPr>
+            <w:tcW w:w="547" w:type="pct"/>
+          </w:tcPr>
+          <w:p>
+            <w:pPr>
+              <w:jc w:val="center"/>
+              <w:rPr>
+                <w:color w:val="000000"/>
+                <w:sz w:val="20"/>
+                <w:szCs w:val="20"/>
+              </w:rPr>
+            </w:pPr>
+            <w:r>
+              <w:rPr>
+                <w:color w:val="000000"/>
+                <w:sz w:val="20"/>
+                <w:szCs w:val="20"/>
+              </w:rPr>
+              <w:t>{passed_11}</w:t>
             </w:r>
           </w:p>
         </w:tc>
@@ -2019,7 +1887,7 @@
         </w:trPr>
         <w:tc>
           <w:tcPr>
-            <w:tcW w:w="217" w:type="pct"/>
+            <w:tcW w:w="209" w:type="pct"/>
           </w:tcPr>
           <w:p>
             <w:pPr>
@@ -2038,13 +1906,13 @@
                 <w:sz w:val="20"/>
                 <w:szCs w:val="20"/>
               </w:rPr>
-              <w:t>13</w:t>
-            </w:r>
-          </w:p>
-        </w:tc>
-        <w:tc>
-          <w:tcPr>
-            <w:tcW w:w="1534" w:type="pct"/>
+              <w:t>12</w:t>
+            </w:r>
+          </w:p>
+        </w:tc>
+        <w:tc>
+          <w:tcPr>
+            <w:tcW w:w="1608" w:type="pct"/>
           </w:tcPr>
           <w:p>
             <w:pPr>
@@ -2064,78 +1932,78 @@
                 <w:szCs w:val="20"/>
                 <w:lang w:eastAsia="en-PH"/>
               </w:rPr>
-              <w:t>{student_13_fname}</w:t>
-            </w:r>
-          </w:p>
-        </w:tc>
-        <w:tc>
-          <w:tcPr>
-            <w:tcW w:w="1093" w:type="pct"/>
-          </w:tcPr>
-          <w:p>
-            <w:pPr>
-              <w:jc w:val="center"/>
-              <w:rPr>
-                <w:rFonts w:ascii="Arial" w:hAnsi="Arial" w:cs="Arial"/>
-                <w:color w:val="000000"/>
-                <w:sz w:val="20"/>
-                <w:szCs w:val="20"/>
-              </w:rPr>
-            </w:pPr>
-            <w:r>
-              <w:rPr>
-                <w:rFonts w:ascii="Arial" w:hAnsi="Arial" w:cs="Arial"/>
-                <w:color w:val="000000"/>
-                <w:sz w:val="20"/>
-                <w:szCs w:val="20"/>
-              </w:rPr>
-              <w:t>{student_13_year_level}</w:t>
-            </w:r>
-          </w:p>
-        </w:tc>
-        <w:tc>
-          <w:tcPr>
-            <w:tcW w:w="1600" w:type="pct"/>
-          </w:tcPr>
-          <w:p>
-            <w:pPr>
-              <w:jc w:val="center"/>
-              <w:rPr>
-                <w:color w:val="000000"/>
-                <w:sz w:val="20"/>
-                <w:szCs w:val="20"/>
-              </w:rPr>
-            </w:pPr>
-            <w:r>
-              <w:rPr>
-                <w:color w:val="000000"/>
-                <w:sz w:val="20"/>
-                <w:szCs w:val="20"/>
-              </w:rPr>
-              <w:t>{student_13_school}</w:t>
-            </w:r>
-          </w:p>
-        </w:tc>
-        <w:tc>
-          <w:tcPr>
-            <w:tcW w:w="555" w:type="pct"/>
-          </w:tcPr>
-          <w:p>
-            <w:pPr>
-              <w:jc w:val="center"/>
-              <w:rPr>
-                <w:color w:val="000000"/>
-                <w:sz w:val="20"/>
-                <w:szCs w:val="20"/>
-              </w:rPr>
-            </w:pPr>
-            <w:r>
-              <w:rPr>
-                <w:color w:val="000000"/>
-                <w:sz w:val="20"/>
-                <w:szCs w:val="20"/>
-              </w:rPr>
-              <w:t>{passed_13}</w:t>
+              <w:t>{student_12_fname}</w:t>
+            </w:r>
+          </w:p>
+        </w:tc>
+        <w:tc>
+          <w:tcPr>
+            <w:tcW w:w="925" w:type="pct"/>
+          </w:tcPr>
+          <w:p>
+            <w:pPr>
+              <w:jc w:val="center"/>
+              <w:rPr>
+                <w:rFonts w:ascii="Arial" w:hAnsi="Arial" w:cs="Arial"/>
+                <w:color w:val="000000"/>
+                <w:sz w:val="18"/>
+                <w:szCs w:val="18"/>
+              </w:rPr>
+            </w:pPr>
+            <w:r>
+              <w:rPr>
+                <w:rFonts w:ascii="Arial" w:hAnsi="Arial" w:cs="Arial"/>
+                <w:color w:val="000000"/>
+                <w:sz w:val="18"/>
+                <w:szCs w:val="18"/>
+              </w:rPr>
+              <w:t>{student_12_year_level}</w:t>
+            </w:r>
+          </w:p>
+        </w:tc>
+        <w:tc>
+          <w:tcPr>
+            <w:tcW w:w="1708" w:type="pct"/>
+          </w:tcPr>
+          <w:p>
+            <w:pPr>
+              <w:jc w:val="center"/>
+              <w:rPr>
+                <w:color w:val="000000"/>
+                <w:sz w:val="18"/>
+                <w:szCs w:val="18"/>
+              </w:rPr>
+            </w:pPr>
+            <w:r>
+              <w:rPr>
+                <w:color w:val="000000"/>
+                <w:sz w:val="18"/>
+                <w:szCs w:val="18"/>
+              </w:rPr>
+              <w:t>{student_12_school}</w:t>
+            </w:r>
+          </w:p>
+        </w:tc>
+        <w:tc>
+          <w:tcPr>
+            <w:tcW w:w="547" w:type="pct"/>
+          </w:tcPr>
+          <w:p>
+            <w:pPr>
+              <w:jc w:val="center"/>
+              <w:rPr>
+                <w:color w:val="000000"/>
+                <w:sz w:val="20"/>
+                <w:szCs w:val="20"/>
+              </w:rPr>
+            </w:pPr>
+            <w:r>
+              <w:rPr>
+                <w:color w:val="000000"/>
+                <w:sz w:val="20"/>
+                <w:szCs w:val="20"/>
+              </w:rPr>
+              <w:t>{passed_12}</w:t>
             </w:r>
           </w:p>
         </w:tc>
@@ -2154,7 +2022,7 @@
         </w:trPr>
         <w:tc>
           <w:tcPr>
-            <w:tcW w:w="217" w:type="pct"/>
+            <w:tcW w:w="209" w:type="pct"/>
           </w:tcPr>
           <w:p>
             <w:pPr>
@@ -2173,13 +2041,13 @@
                 <w:sz w:val="20"/>
                 <w:szCs w:val="20"/>
               </w:rPr>
-              <w:t>14</w:t>
-            </w:r>
-          </w:p>
-        </w:tc>
-        <w:tc>
-          <w:tcPr>
-            <w:tcW w:w="1534" w:type="pct"/>
+              <w:t>13</w:t>
+            </w:r>
+          </w:p>
+        </w:tc>
+        <w:tc>
+          <w:tcPr>
+            <w:tcW w:w="1608" w:type="pct"/>
           </w:tcPr>
           <w:p>
             <w:pPr>
@@ -2199,78 +2067,78 @@
                 <w:szCs w:val="20"/>
                 <w:lang w:eastAsia="en-PH"/>
               </w:rPr>
-              <w:t>{student_14_fname}</w:t>
-            </w:r>
-          </w:p>
-        </w:tc>
-        <w:tc>
-          <w:tcPr>
-            <w:tcW w:w="1093" w:type="pct"/>
-          </w:tcPr>
-          <w:p>
-            <w:pPr>
-              <w:jc w:val="center"/>
-              <w:rPr>
-                <w:rFonts w:ascii="Arial" w:hAnsi="Arial" w:cs="Arial"/>
-                <w:color w:val="000000"/>
-                <w:sz w:val="20"/>
-                <w:szCs w:val="20"/>
-              </w:rPr>
-            </w:pPr>
-            <w:r>
-              <w:rPr>
-                <w:rFonts w:ascii="Arial" w:hAnsi="Arial" w:cs="Arial"/>
-                <w:color w:val="000000"/>
-                <w:sz w:val="20"/>
-                <w:szCs w:val="20"/>
-              </w:rPr>
-              <w:t>{student_14_year_level}</w:t>
-            </w:r>
-          </w:p>
-        </w:tc>
-        <w:tc>
-          <w:tcPr>
-            <w:tcW w:w="1600" w:type="pct"/>
-          </w:tcPr>
-          <w:p>
-            <w:pPr>
-              <w:jc w:val="center"/>
-              <w:rPr>
-                <w:color w:val="000000"/>
-                <w:sz w:val="20"/>
-                <w:szCs w:val="20"/>
-              </w:rPr>
-            </w:pPr>
-            <w:r>
-              <w:rPr>
-                <w:color w:val="000000"/>
-                <w:sz w:val="20"/>
-                <w:szCs w:val="20"/>
-              </w:rPr>
-              <w:t>{student_14_school}</w:t>
-            </w:r>
-          </w:p>
-        </w:tc>
-        <w:tc>
-          <w:tcPr>
-            <w:tcW w:w="555" w:type="pct"/>
-          </w:tcPr>
-          <w:p>
-            <w:pPr>
-              <w:jc w:val="center"/>
-              <w:rPr>
-                <w:color w:val="000000"/>
-                <w:sz w:val="20"/>
-                <w:szCs w:val="20"/>
-              </w:rPr>
-            </w:pPr>
-            <w:r>
-              <w:rPr>
-                <w:color w:val="000000"/>
-                <w:sz w:val="20"/>
-                <w:szCs w:val="20"/>
-              </w:rPr>
-              <w:t>{passed_14}</w:t>
+              <w:t>{student_13_fname}</w:t>
+            </w:r>
+          </w:p>
+        </w:tc>
+        <w:tc>
+          <w:tcPr>
+            <w:tcW w:w="925" w:type="pct"/>
+          </w:tcPr>
+          <w:p>
+            <w:pPr>
+              <w:jc w:val="center"/>
+              <w:rPr>
+                <w:rFonts w:ascii="Arial" w:hAnsi="Arial" w:cs="Arial"/>
+                <w:color w:val="000000"/>
+                <w:sz w:val="18"/>
+                <w:szCs w:val="18"/>
+              </w:rPr>
+            </w:pPr>
+            <w:r>
+              <w:rPr>
+                <w:rFonts w:ascii="Arial" w:hAnsi="Arial" w:cs="Arial"/>
+                <w:color w:val="000000"/>
+                <w:sz w:val="18"/>
+                <w:szCs w:val="18"/>
+              </w:rPr>
+              <w:t>{student_13_year_level}</w:t>
+            </w:r>
+          </w:p>
+        </w:tc>
+        <w:tc>
+          <w:tcPr>
+            <w:tcW w:w="1708" w:type="pct"/>
+          </w:tcPr>
+          <w:p>
+            <w:pPr>
+              <w:jc w:val="center"/>
+              <w:rPr>
+                <w:color w:val="000000"/>
+                <w:sz w:val="18"/>
+                <w:szCs w:val="18"/>
+              </w:rPr>
+            </w:pPr>
+            <w:r>
+              <w:rPr>
+                <w:color w:val="000000"/>
+                <w:sz w:val="18"/>
+                <w:szCs w:val="18"/>
+              </w:rPr>
+              <w:t>{student_13_school}</w:t>
+            </w:r>
+          </w:p>
+        </w:tc>
+        <w:tc>
+          <w:tcPr>
+            <w:tcW w:w="547" w:type="pct"/>
+          </w:tcPr>
+          <w:p>
+            <w:pPr>
+              <w:jc w:val="center"/>
+              <w:rPr>
+                <w:color w:val="000000"/>
+                <w:sz w:val="20"/>
+                <w:szCs w:val="20"/>
+              </w:rPr>
+            </w:pPr>
+            <w:r>
+              <w:rPr>
+                <w:color w:val="000000"/>
+                <w:sz w:val="20"/>
+                <w:szCs w:val="20"/>
+              </w:rPr>
+              <w:t>{passed_13}</w:t>
             </w:r>
           </w:p>
         </w:tc>
@@ -2289,7 +2157,7 @@
         </w:trPr>
         <w:tc>
           <w:tcPr>
-            <w:tcW w:w="217" w:type="pct"/>
+            <w:tcW w:w="209" w:type="pct"/>
           </w:tcPr>
           <w:p>
             <w:pPr>
@@ -2308,13 +2176,13 @@
                 <w:sz w:val="20"/>
                 <w:szCs w:val="20"/>
               </w:rPr>
-              <w:t>15</w:t>
-            </w:r>
-          </w:p>
-        </w:tc>
-        <w:tc>
-          <w:tcPr>
-            <w:tcW w:w="1534" w:type="pct"/>
+              <w:t>14</w:t>
+            </w:r>
+          </w:p>
+        </w:tc>
+        <w:tc>
+          <w:tcPr>
+            <w:tcW w:w="1608" w:type="pct"/>
           </w:tcPr>
           <w:p>
             <w:pPr>
@@ -2334,78 +2202,78 @@
                 <w:szCs w:val="20"/>
                 <w:lang w:eastAsia="en-PH"/>
               </w:rPr>
-              <w:t>{student_15_fname}</w:t>
-            </w:r>
-          </w:p>
-        </w:tc>
-        <w:tc>
-          <w:tcPr>
-            <w:tcW w:w="1093" w:type="pct"/>
-          </w:tcPr>
-          <w:p>
-            <w:pPr>
-              <w:jc w:val="center"/>
-              <w:rPr>
-                <w:rFonts w:ascii="Arial" w:hAnsi="Arial" w:cs="Arial"/>
-                <w:color w:val="000000"/>
-                <w:sz w:val="20"/>
-                <w:szCs w:val="20"/>
-              </w:rPr>
-            </w:pPr>
-            <w:r>
-              <w:rPr>
-                <w:rFonts w:ascii="Arial" w:hAnsi="Arial" w:cs="Arial"/>
-                <w:color w:val="000000"/>
-                <w:sz w:val="20"/>
-                <w:szCs w:val="20"/>
-              </w:rPr>
-              <w:t>{student_15_year_level}</w:t>
-            </w:r>
-          </w:p>
-        </w:tc>
-        <w:tc>
-          <w:tcPr>
-            <w:tcW w:w="1600" w:type="pct"/>
-          </w:tcPr>
-          <w:p>
-            <w:pPr>
-              <w:jc w:val="center"/>
-              <w:rPr>
-                <w:color w:val="000000"/>
-                <w:sz w:val="20"/>
-                <w:szCs w:val="20"/>
-              </w:rPr>
-            </w:pPr>
-            <w:r>
-              <w:rPr>
-                <w:color w:val="000000"/>
-                <w:sz w:val="20"/>
-                <w:szCs w:val="20"/>
-              </w:rPr>
-              <w:t>{student_15_school}</w:t>
-            </w:r>
-          </w:p>
-        </w:tc>
-        <w:tc>
-          <w:tcPr>
-            <w:tcW w:w="555" w:type="pct"/>
-          </w:tcPr>
-          <w:p>
-            <w:pPr>
-              <w:jc w:val="center"/>
-              <w:rPr>
-                <w:color w:val="000000"/>
-                <w:sz w:val="20"/>
-                <w:szCs w:val="20"/>
-              </w:rPr>
-            </w:pPr>
-            <w:r>
-              <w:rPr>
-                <w:color w:val="000000"/>
-                <w:sz w:val="20"/>
-                <w:szCs w:val="20"/>
-              </w:rPr>
-              <w:t>{passed_15}</w:t>
+              <w:t>{student_14_fname}</w:t>
+            </w:r>
+          </w:p>
+        </w:tc>
+        <w:tc>
+          <w:tcPr>
+            <w:tcW w:w="925" w:type="pct"/>
+          </w:tcPr>
+          <w:p>
+            <w:pPr>
+              <w:jc w:val="center"/>
+              <w:rPr>
+                <w:rFonts w:ascii="Arial" w:hAnsi="Arial" w:cs="Arial"/>
+                <w:color w:val="000000"/>
+                <w:sz w:val="18"/>
+                <w:szCs w:val="18"/>
+              </w:rPr>
+            </w:pPr>
+            <w:r>
+              <w:rPr>
+                <w:rFonts w:ascii="Arial" w:hAnsi="Arial" w:cs="Arial"/>
+                <w:color w:val="000000"/>
+                <w:sz w:val="18"/>
+                <w:szCs w:val="18"/>
+              </w:rPr>
+              <w:t>{student_14_year_level}</w:t>
+            </w:r>
+          </w:p>
+        </w:tc>
+        <w:tc>
+          <w:tcPr>
+            <w:tcW w:w="1708" w:type="pct"/>
+          </w:tcPr>
+          <w:p>
+            <w:pPr>
+              <w:jc w:val="center"/>
+              <w:rPr>
+                <w:color w:val="000000"/>
+                <w:sz w:val="18"/>
+                <w:szCs w:val="18"/>
+              </w:rPr>
+            </w:pPr>
+            <w:r>
+              <w:rPr>
+                <w:color w:val="000000"/>
+                <w:sz w:val="18"/>
+                <w:szCs w:val="18"/>
+              </w:rPr>
+              <w:t>{student_14_school}</w:t>
+            </w:r>
+          </w:p>
+        </w:tc>
+        <w:tc>
+          <w:tcPr>
+            <w:tcW w:w="547" w:type="pct"/>
+          </w:tcPr>
+          <w:p>
+            <w:pPr>
+              <w:jc w:val="center"/>
+              <w:rPr>
+                <w:color w:val="000000"/>
+                <w:sz w:val="20"/>
+                <w:szCs w:val="20"/>
+              </w:rPr>
+            </w:pPr>
+            <w:r>
+              <w:rPr>
+                <w:color w:val="000000"/>
+                <w:sz w:val="20"/>
+                <w:szCs w:val="20"/>
+              </w:rPr>
+              <w:t>{passed_14}</w:t>
             </w:r>
           </w:p>
         </w:tc>
@@ -2424,7 +2292,7 @@
         </w:trPr>
         <w:tc>
           <w:tcPr>
-            <w:tcW w:w="217" w:type="pct"/>
+            <w:tcW w:w="209" w:type="pct"/>
           </w:tcPr>
           <w:p>
             <w:pPr>
@@ -2436,11 +2304,20 @@
                 <w:szCs w:val="20"/>
               </w:rPr>
             </w:pPr>
-          </w:p>
-        </w:tc>
-        <w:tc>
-          <w:tcPr>
-            <w:tcW w:w="1534" w:type="pct"/>
+            <w:r>
+              <w:rPr>
+                <w:rFonts w:ascii="Arial" w:hAnsi="Arial" w:cs="Arial"/>
+                <w:color w:val="000000"/>
+                <w:sz w:val="20"/>
+                <w:szCs w:val="20"/>
+              </w:rPr>
+              <w:t>15</w:t>
+            </w:r>
+          </w:p>
+        </w:tc>
+        <w:tc>
+          <w:tcPr>
+            <w:tcW w:w="1608" w:type="pct"/>
           </w:tcPr>
           <w:p>
             <w:pPr>
@@ -2460,44 +2337,170 @@
                 <w:szCs w:val="20"/>
                 <w:lang w:eastAsia="en-PH"/>
               </w:rPr>
+              <w:t>{student_15_fname}</w:t>
+            </w:r>
+          </w:p>
+        </w:tc>
+        <w:tc>
+          <w:tcPr>
+            <w:tcW w:w="925" w:type="pct"/>
+          </w:tcPr>
+          <w:p>
+            <w:pPr>
+              <w:jc w:val="center"/>
+              <w:rPr>
+                <w:rFonts w:ascii="Arial" w:hAnsi="Arial" w:cs="Arial"/>
+                <w:color w:val="000000"/>
+                <w:sz w:val="18"/>
+                <w:szCs w:val="18"/>
+              </w:rPr>
+            </w:pPr>
+            <w:r>
+              <w:rPr>
+                <w:rFonts w:ascii="Arial" w:hAnsi="Arial" w:cs="Arial"/>
+                <w:color w:val="000000"/>
+                <w:sz w:val="18"/>
+                <w:szCs w:val="18"/>
+              </w:rPr>
+              <w:t>{student_15_year_level}</w:t>
+            </w:r>
+          </w:p>
+        </w:tc>
+        <w:tc>
+          <w:tcPr>
+            <w:tcW w:w="1708" w:type="pct"/>
+          </w:tcPr>
+          <w:p>
+            <w:pPr>
+              <w:jc w:val="center"/>
+              <w:rPr>
+                <w:color w:val="000000"/>
+                <w:sz w:val="18"/>
+                <w:szCs w:val="18"/>
+              </w:rPr>
+            </w:pPr>
+            <w:r>
+              <w:rPr>
+                <w:color w:val="000000"/>
+                <w:sz w:val="18"/>
+                <w:szCs w:val="18"/>
+              </w:rPr>
+              <w:t>{student_15_school}</w:t>
+            </w:r>
+          </w:p>
+        </w:tc>
+        <w:tc>
+          <w:tcPr>
+            <w:tcW w:w="547" w:type="pct"/>
+          </w:tcPr>
+          <w:p>
+            <w:pPr>
+              <w:jc w:val="center"/>
+              <w:rPr>
+                <w:color w:val="000000"/>
+                <w:sz w:val="20"/>
+                <w:szCs w:val="20"/>
+              </w:rPr>
+            </w:pPr>
+            <w:r>
+              <w:rPr>
+                <w:color w:val="000000"/>
+                <w:sz w:val="20"/>
+                <w:szCs w:val="20"/>
+              </w:rPr>
+              <w:t>{passed_15}</w:t>
+            </w:r>
+          </w:p>
+        </w:tc>
+      </w:tr>
+      <w:tr>
+        <w:tblPrEx>
+          <w:tblCellMar>
+            <w:top w:w="0" w:type="dxa"/>
+            <w:left w:w="108" w:type="dxa"/>
+            <w:bottom w:w="0" w:type="dxa"/>
+            <w:right w:w="108" w:type="dxa"/>
+          </w:tblCellMar>
+        </w:tblPrEx>
+        <w:trPr>
+          <w:trHeight w:val="258" w:hRule="atLeast"/>
+        </w:trPr>
+        <w:tc>
+          <w:tcPr>
+            <w:tcW w:w="209" w:type="pct"/>
+          </w:tcPr>
+          <w:p>
+            <w:pPr>
+              <w:jc w:val="right"/>
+              <w:rPr>
+                <w:rFonts w:ascii="Arial" w:hAnsi="Arial" w:cs="Arial"/>
+                <w:color w:val="000000"/>
+                <w:sz w:val="20"/>
+                <w:szCs w:val="20"/>
+              </w:rPr>
+            </w:pPr>
+          </w:p>
+        </w:tc>
+        <w:tc>
+          <w:tcPr>
+            <w:tcW w:w="1608" w:type="pct"/>
+          </w:tcPr>
+          <w:p>
+            <w:pPr>
+              <w:rPr>
+                <w:rFonts w:ascii="Arial" w:hAnsi="Arial" w:cs="Arial"/>
+                <w:color w:val="000000"/>
+                <w:sz w:val="20"/>
+                <w:szCs w:val="20"/>
+                <w:lang w:eastAsia="en-PH"/>
+              </w:rPr>
+            </w:pPr>
+            <w:r>
+              <w:rPr>
+                <w:rFonts w:ascii="Arial" w:hAnsi="Arial" w:cs="Arial"/>
+                <w:color w:val="000000"/>
+                <w:sz w:val="20"/>
+                <w:szCs w:val="20"/>
+                <w:lang w:eastAsia="en-PH"/>
+              </w:rPr>
               <w:t>{student_16_fname}</w:t>
             </w:r>
           </w:p>
         </w:tc>
         <w:tc>
           <w:tcPr>
-            <w:tcW w:w="1093" w:type="pct"/>
-          </w:tcPr>
-          <w:p>
-            <w:pPr>
-              <w:jc w:val="center"/>
-              <w:rPr>
-                <w:rFonts w:ascii="Arial" w:hAnsi="Arial" w:cs="Arial"/>
-                <w:color w:val="000000"/>
-                <w:sz w:val="20"/>
-                <w:szCs w:val="20"/>
-              </w:rPr>
-            </w:pPr>
-          </w:p>
-        </w:tc>
-        <w:tc>
-          <w:tcPr>
-            <w:tcW w:w="1600" w:type="pct"/>
-          </w:tcPr>
-          <w:p>
-            <w:pPr>
-              <w:jc w:val="center"/>
-              <w:rPr>
-                <w:color w:val="000000"/>
-                <w:sz w:val="20"/>
-                <w:szCs w:val="20"/>
-              </w:rPr>
-            </w:pPr>
-          </w:p>
-        </w:tc>
-        <w:tc>
-          <w:tcPr>
-            <w:tcW w:w="555" w:type="pct"/>
+            <w:tcW w:w="925" w:type="pct"/>
+          </w:tcPr>
+          <w:p>
+            <w:pPr>
+              <w:jc w:val="center"/>
+              <w:rPr>
+                <w:rFonts w:ascii="Arial" w:hAnsi="Arial" w:cs="Arial"/>
+                <w:color w:val="000000"/>
+                <w:sz w:val="20"/>
+                <w:szCs w:val="20"/>
+              </w:rPr>
+            </w:pPr>
+          </w:p>
+        </w:tc>
+        <w:tc>
+          <w:tcPr>
+            <w:tcW w:w="1708" w:type="pct"/>
+          </w:tcPr>
+          <w:p>
+            <w:pPr>
+              <w:jc w:val="center"/>
+              <w:rPr>
+                <w:color w:val="000000"/>
+                <w:sz w:val="20"/>
+                <w:szCs w:val="20"/>
+              </w:rPr>
+            </w:pPr>
+          </w:p>
+        </w:tc>
+        <w:tc>
+          <w:tcPr>
+            <w:tcW w:w="547" w:type="pct"/>
           </w:tcPr>
           <w:p>
             <w:pPr>
@@ -2512,6 +2515,15 @@
         </w:tc>
       </w:tr>
     </w:tbl>
+    <w:p>
+      <w:pPr>
+        <w:rPr>
+          <w:rFonts w:ascii="Arial" w:hAnsi="Arial" w:cs="Arial"/>
+        </w:rPr>
+      </w:pPr>
+      <w:bookmarkStart w:id="0" w:name="_GoBack"/>
+      <w:bookmarkEnd w:id="0"/>
+    </w:p>
     <w:p>
       <w:pPr>
         <w:rPr>
@@ -2586,8 +2598,6 @@
         </w:rPr>
         <w:t>Executive Assistant I</w:t>
       </w:r>
-      <w:bookmarkStart w:id="0" w:name="_GoBack"/>
-      <w:bookmarkEnd w:id="0"/>
     </w:p>
     <w:p>
       <w:pPr>
@@ -2760,6 +2770,7 @@
     </w:p>
     <w:p>
       <w:pPr>
+        <w:jc w:val="center"/>
         <w:rPr>
           <w:rFonts w:ascii="Arial" w:hAnsi="Arial" w:cs="Arial"/>
           <w:b/>
@@ -2769,53 +2780,22 @@
       <w:r>
         <w:rPr>
           <w:rFonts w:ascii="Arial" w:hAnsi="Arial" w:cs="Arial"/>
-        </w:rPr>
-        <w:tab/>
-      </w:r>
-      <w:r>
-        <w:rPr>
-          <w:rFonts w:ascii="Arial" w:hAnsi="Arial" w:cs="Arial"/>
-        </w:rPr>
-        <w:tab/>
-      </w:r>
-      <w:r>
-        <w:rPr>
-          <w:rFonts w:ascii="Arial" w:hAnsi="Arial" w:cs="Arial"/>
-        </w:rPr>
-        <w:tab/>
-      </w:r>
-      <w:r>
-        <w:rPr>
-          <w:rFonts w:ascii="Arial" w:hAnsi="Arial" w:cs="Arial"/>
-        </w:rPr>
-        <w:t xml:space="preserve">         </w:t>
-      </w:r>
-      <w:r>
-        <w:rPr>
-          <w:rFonts w:ascii="Arial" w:hAnsi="Arial" w:cs="Arial"/>
           <w:b/>
           <w:bCs/>
         </w:rPr>
-        <w:t xml:space="preserve">JOSEL F. VIOLAGO    </w:t>
+        <w:t>JOSEL F. VIOLAGO</w:t>
       </w:r>
     </w:p>
     <w:p>
       <w:pPr>
-        <w:ind w:left="2880"/>
+        <w:ind w:firstLine="3960" w:firstLineChars="1650"/>
+        <w:jc w:val="both"/>
         <w:rPr>
           <w:rFonts w:ascii="Arial" w:hAnsi="Arial" w:cs="Arial"/>
           <w:b/>
           <w:bCs/>
         </w:rPr>
       </w:pPr>
-      <w:r>
-        <w:rPr>
-          <w:rFonts w:ascii="Arial" w:hAnsi="Arial" w:cs="Arial"/>
-          <w:b/>
-          <w:bCs/>
-        </w:rPr>
-        <w:t xml:space="preserve">     </w:t>
-      </w:r>
       <w:r>
         <w:rPr>
           <w:rFonts w:ascii="Arial" w:hAnsi="Arial" w:cs="Arial"/>
@@ -2993,11 +2973,11 @@
     <w:lsdException w:uiPriority="0" w:name="Table 3D effects 2"/>
     <w:lsdException w:uiPriority="0" w:name="Table 3D effects 3"/>
     <w:lsdException w:uiPriority="0" w:name="Table Contemporary"/>
-    <w:lsdException w:unhideWhenUsed="0" w:uiPriority="0" w:semiHidden="0" w:name="Table Elegant"/>
+    <w:lsdException w:qFormat="1" w:unhideWhenUsed="0" w:uiPriority="0" w:semiHidden="0" w:name="Table Elegant"/>
     <w:lsdException w:uiPriority="0" w:name="Table Professional"/>
     <w:lsdException w:uiPriority="0" w:name="Table Subtle 1"/>
     <w:lsdException w:uiPriority="0" w:name="Table Subtle 2"/>
-    <w:lsdException w:unhideWhenUsed="0" w:uiPriority="0" w:semiHidden="0" w:name="Table Web 1"/>
+    <w:lsdException w:qFormat="1" w:unhideWhenUsed="0" w:uiPriority="0" w:semiHidden="0" w:name="Table Web 1"/>
     <w:lsdException w:uiPriority="0" w:name="Table Web 2"/>
     <w:lsdException w:uiPriority="0" w:name="Table Web 3"/>
     <w:lsdException w:qFormat="1" w:unhideWhenUsed="0" w:uiPriority="0" w:semiHidden="0" w:name="Balloon Text"/>
@@ -3313,6 +3293,7 @@
   <w:style w:type="table" w:styleId="9">
     <w:name w:val="Table Elegant"/>
     <w:basedOn w:val="5"/>
+    <w:qFormat/>
     <w:uiPriority w:val="0"/>
     <w:tblPr>
       <w:tblBorders>
@@ -3466,6 +3447,7 @@
   <w:style w:type="table" w:styleId="11">
     <w:name w:val="Table Web 1"/>
     <w:basedOn w:val="5"/>
+    <w:qFormat/>
     <w:uiPriority w:val="0"/>
     <w:tblPr>
       <w:tblCellSpacing w:w="20" w:type="dxa"/>
@@ -3518,6 +3500,7 @@
   <w:style w:type="table" w:customStyle="1" w:styleId="13">
     <w:name w:val="Plain Table 1"/>
     <w:basedOn w:val="5"/>
+    <w:qFormat/>
     <w:uiPriority w:val="41"/>
     <w:tblPr>
       <w:tblBorders>

</xml_diff>